<commit_message>
Added Problem 4 report with part2
</commit_message>
<xml_diff>
--- a/Problem4-Report.docx
+++ b/Problem4-Report.docx
@@ -225,7 +225,7 @@
                     <pic:cNvPicPr/>
                   </pic:nvPicPr>
                   <pic:blipFill>
-                    <a:blip r:embed="rId6">
+                    <a:blip r:embed="rId7">
                       <a:extLst>
                         <a:ext uri="{28A0092B-C50C-407E-A947-70E740481C1C}">
                           <a14:useLocalDpi xmlns:a14="http://schemas.microsoft.com/office/drawing/2010/main" val="0"/>
@@ -694,7 +694,7 @@
                     <pic:cNvPicPr/>
                   </pic:nvPicPr>
                   <pic:blipFill>
-                    <a:blip r:embed="rId7">
+                    <a:blip r:embed="rId8">
                       <a:extLst>
                         <a:ext uri="{28A0092B-C50C-407E-A947-70E740481C1C}">
                           <a14:useLocalDpi xmlns:a14="http://schemas.microsoft.com/office/drawing/2010/main" val="0"/>
@@ -1029,7 +1029,7 @@
                     <pic:cNvPicPr/>
                   </pic:nvPicPr>
                   <pic:blipFill>
-                    <a:blip r:embed="rId8" cstate="print">
+                    <a:blip r:embed="rId9" cstate="print">
                       <a:extLst>
                         <a:ext uri="{28A0092B-C50C-407E-A947-70E740481C1C}">
                           <a14:useLocalDpi xmlns:a14="http://schemas.microsoft.com/office/drawing/2010/main" val="0"/>
@@ -1088,7 +1088,7 @@
                     <pic:cNvPicPr/>
                   </pic:nvPicPr>
                   <pic:blipFill>
-                    <a:blip r:embed="rId9" cstate="print">
+                    <a:blip r:embed="rId10" cstate="print">
                       <a:extLst>
                         <a:ext uri="{28A0092B-C50C-407E-A947-70E740481C1C}">
                           <a14:useLocalDpi xmlns:a14="http://schemas.microsoft.com/office/drawing/2010/main" val="0"/>
@@ -1293,7 +1293,7 @@
                     <pic:cNvPicPr/>
                   </pic:nvPicPr>
                   <pic:blipFill>
-                    <a:blip r:embed="rId10">
+                    <a:blip r:embed="rId11">
                       <a:extLst>
                         <a:ext uri="{28A0092B-C50C-407E-A947-70E740481C1C}">
                           <a14:useLocalDpi xmlns:a14="http://schemas.microsoft.com/office/drawing/2010/main" val="0"/>
@@ -1440,7 +1440,7 @@
                     <pic:cNvPicPr/>
                   </pic:nvPicPr>
                   <pic:blipFill>
-                    <a:blip r:embed="rId11" cstate="print">
+                    <a:blip r:embed="rId12" cstate="print">
                       <a:extLst>
                         <a:ext uri="{28A0092B-C50C-407E-A947-70E740481C1C}">
                           <a14:useLocalDpi xmlns:a14="http://schemas.microsoft.com/office/drawing/2010/main" val="0"/>
@@ -1497,7 +1497,7 @@
                     <pic:cNvPicPr/>
                   </pic:nvPicPr>
                   <pic:blipFill>
-                    <a:blip r:embed="rId12">
+                    <a:blip r:embed="rId13">
                       <a:extLst>
                         <a:ext uri="{28A0092B-C50C-407E-A947-70E740481C1C}">
                           <a14:useLocalDpi xmlns:a14="http://schemas.microsoft.com/office/drawing/2010/main" val="0"/>
@@ -1696,7 +1696,7 @@
                     <pic:cNvPicPr/>
                   </pic:nvPicPr>
                   <pic:blipFill>
-                    <a:blip r:embed="rId13" cstate="print">
+                    <a:blip r:embed="rId14" cstate="print">
                       <a:extLst>
                         <a:ext uri="{28A0092B-C50C-407E-A947-70E740481C1C}">
                           <a14:useLocalDpi xmlns:a14="http://schemas.microsoft.com/office/drawing/2010/main" val="0"/>
@@ -1901,7 +1901,7 @@
                     <pic:cNvPicPr/>
                   </pic:nvPicPr>
                   <pic:blipFill>
-                    <a:blip r:embed="rId14" cstate="print">
+                    <a:blip r:embed="rId15" cstate="print">
                       <a:extLst>
                         <a:ext uri="{28A0092B-C50C-407E-A947-70E740481C1C}">
                           <a14:useLocalDpi xmlns:a14="http://schemas.microsoft.com/office/drawing/2010/main" val="0"/>
@@ -2000,7 +2000,7 @@
                     <pic:cNvPicPr/>
                   </pic:nvPicPr>
                   <pic:blipFill>
-                    <a:blip r:embed="rId15" cstate="print">
+                    <a:blip r:embed="rId16" cstate="print">
                       <a:extLst>
                         <a:ext uri="{28A0092B-C50C-407E-A947-70E740481C1C}">
                           <a14:useLocalDpi xmlns:a14="http://schemas.microsoft.com/office/drawing/2010/main" val="0"/>
@@ -2125,7 +2125,7 @@
                     <pic:cNvPicPr/>
                   </pic:nvPicPr>
                   <pic:blipFill>
-                    <a:blip r:embed="rId16"/>
+                    <a:blip r:embed="rId17"/>
                     <a:stretch>
                       <a:fillRect/>
                     </a:stretch>
@@ -2494,6 +2494,2522 @@
         <w:jc w:val="both"/>
       </w:pPr>
     </w:p>
+    <w:p>
+      <w:pPr>
+        <w:tabs>
+          <w:tab w:val="left" w:pos="1392"/>
+        </w:tabs>
+        <w:jc w:val="both"/>
+      </w:pPr>
+    </w:p>
+    <w:p>
+      <w:pPr>
+        <w:tabs>
+          <w:tab w:val="left" w:pos="1392"/>
+        </w:tabs>
+        <w:jc w:val="both"/>
+      </w:pPr>
+    </w:p>
+    <w:p>
+      <w:pPr>
+        <w:tabs>
+          <w:tab w:val="left" w:pos="1392"/>
+        </w:tabs>
+        <w:jc w:val="both"/>
+      </w:pPr>
+    </w:p>
+    <w:p>
+      <w:pPr>
+        <w:tabs>
+          <w:tab w:val="left" w:pos="1392"/>
+        </w:tabs>
+        <w:jc w:val="both"/>
+        <w:rPr>
+          <w:b/>
+          <w:bCs/>
+          <w:sz w:val="32"/>
+          <w:szCs w:val="32"/>
+        </w:rPr>
+      </w:pPr>
+      <w:r>
+        <w:rPr>
+          <w:b/>
+          <w:bCs/>
+          <w:sz w:val="32"/>
+          <w:szCs w:val="32"/>
+        </w:rPr>
+        <w:t>Part-2</w:t>
+      </w:r>
+    </w:p>
+    <w:p>
+      <w:pPr>
+        <w:tabs>
+          <w:tab w:val="left" w:pos="1392"/>
+        </w:tabs>
+        <w:jc w:val="both"/>
+        <w:rPr>
+          <w:b/>
+          <w:bCs/>
+          <w:sz w:val="32"/>
+          <w:szCs w:val="32"/>
+        </w:rPr>
+      </w:pPr>
+    </w:p>
+    <w:p>
+      <w:pPr>
+        <w:tabs>
+          <w:tab w:val="left" w:pos="1392"/>
+        </w:tabs>
+        <w:jc w:val="both"/>
+        <w:rPr>
+          <w:b/>
+          <w:bCs/>
+          <w:sz w:val="28"/>
+          <w:szCs w:val="28"/>
+        </w:rPr>
+      </w:pPr>
+      <w:r>
+        <w:rPr>
+          <w:b/>
+          <w:bCs/>
+          <w:sz w:val="28"/>
+          <w:szCs w:val="28"/>
+        </w:rPr>
+        <w:t>Problem 1: Randomized Quicksort Tracing</w:t>
+      </w:r>
+    </w:p>
+    <w:p>
+      <w:pPr>
+        <w:tabs>
+          <w:tab w:val="left" w:pos="1392"/>
+        </w:tabs>
+        <w:jc w:val="both"/>
+        <w:rPr>
+          <w:b/>
+          <w:bCs/>
+          <w:sz w:val="28"/>
+          <w:szCs w:val="28"/>
+        </w:rPr>
+      </w:pPr>
+    </w:p>
+    <w:p>
+      <w:pPr>
+        <w:tabs>
+          <w:tab w:val="left" w:pos="1392"/>
+        </w:tabs>
+        <w:jc w:val="both"/>
+        <w:rPr>
+          <w:b/>
+          <w:bCs/>
+        </w:rPr>
+      </w:pPr>
+      <w:r>
+        <w:rPr>
+          <w:b/>
+          <w:bCs/>
+        </w:rPr>
+        <w:t>Best Case</w:t>
+      </w:r>
+    </w:p>
+    <w:p>
+      <w:pPr>
+        <w:tabs>
+          <w:tab w:val="left" w:pos="1392"/>
+        </w:tabs>
+        <w:jc w:val="both"/>
+      </w:pPr>
+      <w:r>
+        <w:t>Input-</w:t>
+      </w:r>
+      <w:r>
+        <w:t xml:space="preserve"> </w:t>
+      </w:r>
+      <w:r>
+        <w:t>[4, 2, 6, 1, 5, 3]</w:t>
+      </w:r>
+    </w:p>
+    <w:p>
+      <w:pPr>
+        <w:tabs>
+          <w:tab w:val="left" w:pos="1392"/>
+        </w:tabs>
+        <w:jc w:val="both"/>
+      </w:pPr>
+    </w:p>
+    <w:p>
+      <w:pPr>
+        <w:tabs>
+          <w:tab w:val="left" w:pos="1392"/>
+        </w:tabs>
+        <w:jc w:val="both"/>
+      </w:pPr>
+      <w:r>
+        <w:t>Steps:</w:t>
+      </w:r>
+    </w:p>
+    <w:p>
+      <w:pPr>
+        <w:pStyle w:val="ListParagraph"/>
+        <w:numPr>
+          <w:ilvl w:val="0"/>
+          <w:numId w:val="1"/>
+        </w:numPr>
+        <w:tabs>
+          <w:tab w:val="left" w:pos="1392"/>
+        </w:tabs>
+        <w:jc w:val="both"/>
+      </w:pPr>
+      <w:r>
+        <w:t>Pivot = 4</w:t>
+      </w:r>
+    </w:p>
+    <w:p>
+      <w:pPr>
+        <w:pStyle w:val="ListParagraph"/>
+        <w:numPr>
+          <w:ilvl w:val="1"/>
+          <w:numId w:val="1"/>
+        </w:numPr>
+        <w:tabs>
+          <w:tab w:val="left" w:pos="1392"/>
+        </w:tabs>
+        <w:jc w:val="both"/>
+      </w:pPr>
+      <w:r>
+        <w:t>Pivot = 4</w:t>
+      </w:r>
+    </w:p>
+    <w:p>
+      <w:pPr>
+        <w:pStyle w:val="ListParagraph"/>
+        <w:numPr>
+          <w:ilvl w:val="1"/>
+          <w:numId w:val="1"/>
+        </w:numPr>
+        <w:tabs>
+          <w:tab w:val="left" w:pos="1392"/>
+        </w:tabs>
+        <w:jc w:val="both"/>
+      </w:pPr>
+      <w:r>
+        <w:t>Left: [2, 1, 3]</w:t>
+      </w:r>
+    </w:p>
+    <w:p>
+      <w:pPr>
+        <w:pStyle w:val="ListParagraph"/>
+        <w:numPr>
+          <w:ilvl w:val="1"/>
+          <w:numId w:val="1"/>
+        </w:numPr>
+        <w:tabs>
+          <w:tab w:val="left" w:pos="1392"/>
+        </w:tabs>
+        <w:jc w:val="both"/>
+      </w:pPr>
+      <w:r>
+        <w:t>Right: [6, 5]</w:t>
+      </w:r>
+    </w:p>
+    <w:p>
+      <w:pPr>
+        <w:pStyle w:val="ListParagraph"/>
+        <w:tabs>
+          <w:tab w:val="left" w:pos="1392"/>
+        </w:tabs>
+        <w:ind w:left="1440"/>
+        <w:jc w:val="both"/>
+      </w:pPr>
+    </w:p>
+    <w:p>
+      <w:pPr>
+        <w:pStyle w:val="ListParagraph"/>
+        <w:numPr>
+          <w:ilvl w:val="0"/>
+          <w:numId w:val="1"/>
+        </w:numPr>
+        <w:tabs>
+          <w:tab w:val="left" w:pos="1392"/>
+        </w:tabs>
+        <w:jc w:val="both"/>
+      </w:pPr>
+      <w:r>
+        <w:t>Sort left [2, 1, 3]</w:t>
+      </w:r>
+    </w:p>
+    <w:p>
+      <w:pPr>
+        <w:pStyle w:val="ListParagraph"/>
+        <w:numPr>
+          <w:ilvl w:val="1"/>
+          <w:numId w:val="1"/>
+        </w:numPr>
+        <w:tabs>
+          <w:tab w:val="left" w:pos="1392"/>
+        </w:tabs>
+        <w:jc w:val="both"/>
+      </w:pPr>
+      <w:r>
+        <w:t>Pivot = 2</w:t>
+      </w:r>
+    </w:p>
+    <w:p>
+      <w:pPr>
+        <w:pStyle w:val="ListParagraph"/>
+        <w:numPr>
+          <w:ilvl w:val="1"/>
+          <w:numId w:val="1"/>
+        </w:numPr>
+        <w:tabs>
+          <w:tab w:val="left" w:pos="1392"/>
+        </w:tabs>
+        <w:jc w:val="both"/>
+      </w:pPr>
+      <w:r>
+        <w:t>Left: [1]</w:t>
+      </w:r>
+    </w:p>
+    <w:p>
+      <w:pPr>
+        <w:pStyle w:val="ListParagraph"/>
+        <w:numPr>
+          <w:ilvl w:val="1"/>
+          <w:numId w:val="1"/>
+        </w:numPr>
+        <w:tabs>
+          <w:tab w:val="left" w:pos="1392"/>
+        </w:tabs>
+        <w:jc w:val="both"/>
+      </w:pPr>
+      <w:r>
+        <w:t>Right: [3]</w:t>
+      </w:r>
+    </w:p>
+    <w:p>
+      <w:pPr>
+        <w:pStyle w:val="ListParagraph"/>
+        <w:numPr>
+          <w:ilvl w:val="0"/>
+          <w:numId w:val="1"/>
+        </w:numPr>
+        <w:tabs>
+          <w:tab w:val="left" w:pos="1392"/>
+        </w:tabs>
+        <w:jc w:val="both"/>
+      </w:pPr>
+      <w:r>
+        <w:t>Sort right [6, 5]</w:t>
+      </w:r>
+    </w:p>
+    <w:p>
+      <w:pPr>
+        <w:pStyle w:val="ListParagraph"/>
+        <w:numPr>
+          <w:ilvl w:val="1"/>
+          <w:numId w:val="1"/>
+        </w:numPr>
+        <w:tabs>
+          <w:tab w:val="left" w:pos="1392"/>
+        </w:tabs>
+        <w:jc w:val="both"/>
+      </w:pPr>
+      <w:r>
+        <w:t>Pivot = 6</w:t>
+      </w:r>
+    </w:p>
+    <w:p>
+      <w:pPr>
+        <w:pStyle w:val="ListParagraph"/>
+        <w:numPr>
+          <w:ilvl w:val="1"/>
+          <w:numId w:val="1"/>
+        </w:numPr>
+        <w:tabs>
+          <w:tab w:val="left" w:pos="1392"/>
+        </w:tabs>
+        <w:jc w:val="both"/>
+      </w:pPr>
+      <w:r>
+        <w:t>Left: [5]</w:t>
+      </w:r>
+    </w:p>
+    <w:p>
+      <w:pPr>
+        <w:pStyle w:val="ListParagraph"/>
+        <w:numPr>
+          <w:ilvl w:val="1"/>
+          <w:numId w:val="1"/>
+        </w:numPr>
+        <w:tabs>
+          <w:tab w:val="left" w:pos="1392"/>
+        </w:tabs>
+        <w:jc w:val="both"/>
+      </w:pPr>
+      <w:r>
+        <w:t>Right: []</w:t>
+      </w:r>
+    </w:p>
+    <w:p>
+      <w:pPr>
+        <w:spacing w:before="100" w:beforeAutospacing="1" w:after="100" w:afterAutospacing="1" w:line="240" w:lineRule="auto"/>
+        <w:rPr>
+          <w:rFonts w:eastAsia="Times New Roman" w:cs="Times New Roman"/>
+          <w:kern w:val="0"/>
+          <w14:ligatures w14:val="none"/>
+        </w:rPr>
+      </w:pPr>
+      <w:r>
+        <w:rPr>
+          <w:rFonts w:eastAsia="Times New Roman" w:cs="Times New Roman"/>
+          <w:kern w:val="0"/>
+          <w14:ligatures w14:val="none"/>
+        </w:rPr>
+        <w:t>sorted array:</w:t>
+      </w:r>
+      <w:r>
+        <w:rPr>
+          <w:rFonts w:eastAsia="Times New Roman" w:cs="Times New Roman"/>
+          <w:kern w:val="0"/>
+          <w14:ligatures w14:val="none"/>
+        </w:rPr>
+        <w:t xml:space="preserve"> </w:t>
+      </w:r>
+      <w:r>
+        <w:rPr>
+          <w:rFonts w:eastAsia="Times New Roman" w:cs="Courier New"/>
+          <w:kern w:val="0"/>
+          <w:sz w:val="20"/>
+          <w:szCs w:val="20"/>
+          <w14:ligatures w14:val="none"/>
+        </w:rPr>
+        <w:t>[1, 2, 3, 4, 5, 6]</w:t>
+      </w:r>
+    </w:p>
+    <w:p>
+      <w:pPr>
+        <w:tabs>
+          <w:tab w:val="left" w:pos="1392"/>
+        </w:tabs>
+        <w:jc w:val="both"/>
+      </w:pPr>
+      <w:r>
+        <w:t xml:space="preserve">The main reason for this being the best case is </w:t>
+      </w:r>
+      <w:r>
+        <w:t>the</w:t>
+      </w:r>
+      <w:r>
+        <w:t xml:space="preserve"> pivot divides the array into balanced parts, so recursion depth stays small.</w:t>
+      </w:r>
+    </w:p>
+    <w:p>
+      <w:pPr>
+        <w:tabs>
+          <w:tab w:val="left" w:pos="1392"/>
+        </w:tabs>
+        <w:jc w:val="both"/>
+      </w:pPr>
+    </w:p>
+    <w:p>
+      <w:pPr>
+        <w:tabs>
+          <w:tab w:val="left" w:pos="1392"/>
+        </w:tabs>
+        <w:jc w:val="both"/>
+        <w:rPr>
+          <w:b/>
+          <w:bCs/>
+        </w:rPr>
+      </w:pPr>
+      <w:r>
+        <w:rPr>
+          <w:b/>
+          <w:bCs/>
+        </w:rPr>
+        <w:t>Worst Case</w:t>
+      </w:r>
+    </w:p>
+    <w:p>
+      <w:pPr>
+        <w:tabs>
+          <w:tab w:val="left" w:pos="1392"/>
+        </w:tabs>
+        <w:jc w:val="both"/>
+      </w:pPr>
+      <w:r>
+        <w:t>In this we u</w:t>
+      </w:r>
+      <w:r>
+        <w:t>se an example where the pivot always ends up being the smallest or largest element.</w:t>
+      </w:r>
+    </w:p>
+    <w:p>
+      <w:pPr>
+        <w:tabs>
+          <w:tab w:val="left" w:pos="1392"/>
+        </w:tabs>
+        <w:jc w:val="both"/>
+      </w:pPr>
+      <w:r>
+        <w:lastRenderedPageBreak/>
+        <w:t xml:space="preserve">Input- </w:t>
+      </w:r>
+      <w:r>
+        <w:t>[1, 2, 3, 4, 5, 6]</w:t>
+      </w:r>
+    </w:p>
+    <w:p>
+      <w:pPr>
+        <w:tabs>
+          <w:tab w:val="left" w:pos="1392"/>
+        </w:tabs>
+        <w:jc w:val="both"/>
+      </w:pPr>
+    </w:p>
+    <w:p>
+      <w:pPr>
+        <w:tabs>
+          <w:tab w:val="left" w:pos="1392"/>
+        </w:tabs>
+        <w:jc w:val="both"/>
+      </w:pPr>
+      <w:r>
+        <w:t>Trace:</w:t>
+      </w:r>
+    </w:p>
+    <w:p>
+      <w:pPr>
+        <w:pStyle w:val="ListParagraph"/>
+        <w:numPr>
+          <w:ilvl w:val="0"/>
+          <w:numId w:val="2"/>
+        </w:numPr>
+        <w:tabs>
+          <w:tab w:val="left" w:pos="1392"/>
+        </w:tabs>
+        <w:jc w:val="both"/>
+      </w:pPr>
+      <w:r>
+        <w:t>Pivot = 6</w:t>
+      </w:r>
+    </w:p>
+    <w:p>
+      <w:pPr>
+        <w:pStyle w:val="ListParagraph"/>
+        <w:numPr>
+          <w:ilvl w:val="1"/>
+          <w:numId w:val="2"/>
+        </w:numPr>
+        <w:tabs>
+          <w:tab w:val="left" w:pos="1392"/>
+        </w:tabs>
+        <w:jc w:val="both"/>
+      </w:pPr>
+      <w:r>
+        <w:t>Left: [1, 2, 3, 4, 5]</w:t>
+      </w:r>
+    </w:p>
+    <w:p>
+      <w:pPr>
+        <w:pStyle w:val="ListParagraph"/>
+        <w:numPr>
+          <w:ilvl w:val="1"/>
+          <w:numId w:val="2"/>
+        </w:numPr>
+        <w:tabs>
+          <w:tab w:val="left" w:pos="1392"/>
+        </w:tabs>
+        <w:jc w:val="both"/>
+      </w:pPr>
+      <w:r>
+        <w:t>Right: []</w:t>
+      </w:r>
+    </w:p>
+    <w:p>
+      <w:pPr>
+        <w:pStyle w:val="ListParagraph"/>
+        <w:numPr>
+          <w:ilvl w:val="0"/>
+          <w:numId w:val="2"/>
+        </w:numPr>
+        <w:tabs>
+          <w:tab w:val="left" w:pos="1392"/>
+        </w:tabs>
+        <w:jc w:val="both"/>
+      </w:pPr>
+      <w:r>
+        <w:t>Pivot = 5</w:t>
+      </w:r>
+    </w:p>
+    <w:p>
+      <w:pPr>
+        <w:pStyle w:val="ListParagraph"/>
+        <w:numPr>
+          <w:ilvl w:val="1"/>
+          <w:numId w:val="2"/>
+        </w:numPr>
+        <w:tabs>
+          <w:tab w:val="left" w:pos="1392"/>
+        </w:tabs>
+        <w:jc w:val="both"/>
+      </w:pPr>
+      <w:r>
+        <w:t>Left: [1, 2, 3, 4]</w:t>
+      </w:r>
+    </w:p>
+    <w:p>
+      <w:pPr>
+        <w:pStyle w:val="ListParagraph"/>
+        <w:numPr>
+          <w:ilvl w:val="1"/>
+          <w:numId w:val="2"/>
+        </w:numPr>
+        <w:tabs>
+          <w:tab w:val="left" w:pos="1392"/>
+        </w:tabs>
+        <w:jc w:val="both"/>
+      </w:pPr>
+      <w:r>
+        <w:t>Right: []</w:t>
+      </w:r>
+    </w:p>
+    <w:p>
+      <w:pPr>
+        <w:pStyle w:val="ListParagraph"/>
+        <w:numPr>
+          <w:ilvl w:val="0"/>
+          <w:numId w:val="2"/>
+        </w:numPr>
+        <w:tabs>
+          <w:tab w:val="left" w:pos="1392"/>
+        </w:tabs>
+        <w:jc w:val="both"/>
+      </w:pPr>
+      <w:r>
+        <w:t>Pivot = 4</w:t>
+      </w:r>
+    </w:p>
+    <w:p>
+      <w:pPr>
+        <w:pStyle w:val="ListParagraph"/>
+        <w:numPr>
+          <w:ilvl w:val="1"/>
+          <w:numId w:val="2"/>
+        </w:numPr>
+        <w:tabs>
+          <w:tab w:val="left" w:pos="1392"/>
+        </w:tabs>
+        <w:jc w:val="both"/>
+      </w:pPr>
+      <w:r>
+        <w:t>Left: [1, 2, 3]</w:t>
+      </w:r>
+    </w:p>
+    <w:p>
+      <w:pPr>
+        <w:pStyle w:val="ListParagraph"/>
+        <w:numPr>
+          <w:ilvl w:val="1"/>
+          <w:numId w:val="2"/>
+        </w:numPr>
+        <w:tabs>
+          <w:tab w:val="left" w:pos="1392"/>
+        </w:tabs>
+        <w:jc w:val="both"/>
+      </w:pPr>
+      <w:r>
+        <w:t>Right: []</w:t>
+      </w:r>
+    </w:p>
+    <w:p>
+      <w:pPr>
+        <w:pStyle w:val="ListParagraph"/>
+        <w:numPr>
+          <w:ilvl w:val="0"/>
+          <w:numId w:val="2"/>
+        </w:numPr>
+        <w:tabs>
+          <w:tab w:val="left" w:pos="1392"/>
+        </w:tabs>
+        <w:jc w:val="both"/>
+      </w:pPr>
+      <w:r>
+        <w:t>Pivot = 3</w:t>
+      </w:r>
+    </w:p>
+    <w:p>
+      <w:pPr>
+        <w:pStyle w:val="ListParagraph"/>
+        <w:numPr>
+          <w:ilvl w:val="1"/>
+          <w:numId w:val="2"/>
+        </w:numPr>
+        <w:tabs>
+          <w:tab w:val="left" w:pos="1392"/>
+        </w:tabs>
+        <w:jc w:val="both"/>
+      </w:pPr>
+      <w:r>
+        <w:t>Left: [1, 2]</w:t>
+      </w:r>
+    </w:p>
+    <w:p>
+      <w:pPr>
+        <w:pStyle w:val="ListParagraph"/>
+        <w:numPr>
+          <w:ilvl w:val="1"/>
+          <w:numId w:val="2"/>
+        </w:numPr>
+        <w:tabs>
+          <w:tab w:val="left" w:pos="1392"/>
+        </w:tabs>
+        <w:jc w:val="both"/>
+      </w:pPr>
+      <w:r>
+        <w:t>Right: []</w:t>
+      </w:r>
+    </w:p>
+    <w:p>
+      <w:pPr>
+        <w:pStyle w:val="ListParagraph"/>
+        <w:numPr>
+          <w:ilvl w:val="0"/>
+          <w:numId w:val="2"/>
+        </w:numPr>
+        <w:tabs>
+          <w:tab w:val="left" w:pos="1392"/>
+        </w:tabs>
+        <w:jc w:val="both"/>
+      </w:pPr>
+      <w:r>
+        <w:t>Pivot = 2</w:t>
+      </w:r>
+    </w:p>
+    <w:p>
+      <w:pPr>
+        <w:pStyle w:val="ListParagraph"/>
+        <w:numPr>
+          <w:ilvl w:val="1"/>
+          <w:numId w:val="2"/>
+        </w:numPr>
+        <w:tabs>
+          <w:tab w:val="left" w:pos="1392"/>
+        </w:tabs>
+        <w:jc w:val="both"/>
+      </w:pPr>
+      <w:r>
+        <w:t>Left: [1]</w:t>
+      </w:r>
+    </w:p>
+    <w:p>
+      <w:pPr>
+        <w:pStyle w:val="ListParagraph"/>
+        <w:numPr>
+          <w:ilvl w:val="1"/>
+          <w:numId w:val="2"/>
+        </w:numPr>
+        <w:tabs>
+          <w:tab w:val="left" w:pos="1392"/>
+        </w:tabs>
+        <w:jc w:val="both"/>
+      </w:pPr>
+      <w:r>
+        <w:t>Right: []</w:t>
+      </w:r>
+    </w:p>
+    <w:p>
+      <w:pPr>
+        <w:tabs>
+          <w:tab w:val="left" w:pos="1392"/>
+        </w:tabs>
+        <w:jc w:val="both"/>
+      </w:pPr>
+      <w:r>
+        <w:t>Sorted array-</w:t>
+      </w:r>
+      <w:r>
+        <w:t xml:space="preserve"> </w:t>
+      </w:r>
+      <w:r>
+        <w:t>[1, 2, 3, 4, 5, 6]</w:t>
+      </w:r>
+    </w:p>
+    <w:p>
+      <w:pPr>
+        <w:tabs>
+          <w:tab w:val="left" w:pos="1392"/>
+        </w:tabs>
+        <w:jc w:val="both"/>
+      </w:pPr>
+      <w:r>
+        <w:t xml:space="preserve">Here this is the worst case because </w:t>
+      </w:r>
+      <w:r>
+        <w:t>the</w:t>
+      </w:r>
+      <w:r>
+        <w:t xml:space="preserve"> pivot gives very uneven </w:t>
+      </w:r>
+      <w:proofErr w:type="gramStart"/>
+      <w:r>
+        <w:t>partitions</w:t>
+      </w:r>
+      <w:proofErr w:type="gramEnd"/>
+      <w:r>
+        <w:t xml:space="preserve"> </w:t>
+      </w:r>
+      <w:r>
+        <w:t>so the recursion becomes deep.</w:t>
+      </w:r>
+    </w:p>
+    <w:p>
+      <w:pPr>
+        <w:tabs>
+          <w:tab w:val="left" w:pos="1392"/>
+        </w:tabs>
+        <w:jc w:val="both"/>
+      </w:pPr>
+    </w:p>
+    <w:p>
+      <w:pPr>
+        <w:tabs>
+          <w:tab w:val="left" w:pos="1392"/>
+        </w:tabs>
+        <w:jc w:val="both"/>
+        <w:rPr>
+          <w:b/>
+          <w:bCs/>
+        </w:rPr>
+      </w:pPr>
+      <w:r>
+        <w:rPr>
+          <w:b/>
+          <w:bCs/>
+        </w:rPr>
+        <w:t>Average Case</w:t>
+      </w:r>
+    </w:p>
+    <w:p>
+      <w:pPr>
+        <w:tabs>
+          <w:tab w:val="left" w:pos="1392"/>
+        </w:tabs>
+        <w:jc w:val="both"/>
+      </w:pPr>
+      <w:r>
+        <w:t>Use a random permutation of at least 6 elements</w:t>
+      </w:r>
+    </w:p>
+    <w:p>
+      <w:pPr>
+        <w:tabs>
+          <w:tab w:val="left" w:pos="1392"/>
+        </w:tabs>
+        <w:jc w:val="both"/>
+      </w:pPr>
+      <w:r>
+        <w:t>Input-</w:t>
+      </w:r>
+      <w:r>
+        <w:t xml:space="preserve"> </w:t>
+      </w:r>
+      <w:r>
+        <w:t>[5, 2, 8, 1, 6, 3, 7]</w:t>
+      </w:r>
+    </w:p>
+    <w:p>
+      <w:pPr>
+        <w:tabs>
+          <w:tab w:val="left" w:pos="1392"/>
+        </w:tabs>
+        <w:jc w:val="both"/>
+      </w:pPr>
+      <w:r>
+        <w:t>Trace:</w:t>
+      </w:r>
+    </w:p>
+    <w:p>
+      <w:pPr>
+        <w:pStyle w:val="ListParagraph"/>
+        <w:numPr>
+          <w:ilvl w:val="0"/>
+          <w:numId w:val="3"/>
+        </w:numPr>
+        <w:tabs>
+          <w:tab w:val="left" w:pos="1392"/>
+        </w:tabs>
+        <w:jc w:val="both"/>
+      </w:pPr>
+      <w:r>
+        <w:t>Pivot = 6</w:t>
+      </w:r>
+    </w:p>
+    <w:p>
+      <w:pPr>
+        <w:pStyle w:val="ListParagraph"/>
+        <w:numPr>
+          <w:ilvl w:val="1"/>
+          <w:numId w:val="3"/>
+        </w:numPr>
+        <w:tabs>
+          <w:tab w:val="left" w:pos="1392"/>
+        </w:tabs>
+        <w:jc w:val="both"/>
+      </w:pPr>
+      <w:r>
+        <w:t>Left: [5, 2, 1, 3]</w:t>
+      </w:r>
+    </w:p>
+    <w:p>
+      <w:pPr>
+        <w:pStyle w:val="ListParagraph"/>
+        <w:numPr>
+          <w:ilvl w:val="1"/>
+          <w:numId w:val="3"/>
+        </w:numPr>
+        <w:tabs>
+          <w:tab w:val="left" w:pos="1392"/>
+        </w:tabs>
+        <w:jc w:val="both"/>
+      </w:pPr>
+      <w:r>
+        <w:t>Right: [8, 7]</w:t>
+      </w:r>
+    </w:p>
+    <w:p>
+      <w:pPr>
+        <w:pStyle w:val="ListParagraph"/>
+        <w:numPr>
+          <w:ilvl w:val="0"/>
+          <w:numId w:val="3"/>
+        </w:numPr>
+        <w:tabs>
+          <w:tab w:val="left" w:pos="1392"/>
+        </w:tabs>
+        <w:jc w:val="both"/>
+      </w:pPr>
+      <w:r>
+        <w:t>Sort left [5, 2, 1, 3]</w:t>
+      </w:r>
+    </w:p>
+    <w:p>
+      <w:pPr>
+        <w:pStyle w:val="ListParagraph"/>
+        <w:numPr>
+          <w:ilvl w:val="1"/>
+          <w:numId w:val="3"/>
+        </w:numPr>
+        <w:tabs>
+          <w:tab w:val="left" w:pos="1392"/>
+        </w:tabs>
+        <w:jc w:val="both"/>
+      </w:pPr>
+      <w:r>
+        <w:t>Pivot = 3</w:t>
+      </w:r>
+    </w:p>
+    <w:p>
+      <w:pPr>
+        <w:pStyle w:val="ListParagraph"/>
+        <w:numPr>
+          <w:ilvl w:val="1"/>
+          <w:numId w:val="3"/>
+        </w:numPr>
+        <w:tabs>
+          <w:tab w:val="left" w:pos="1392"/>
+        </w:tabs>
+        <w:jc w:val="both"/>
+      </w:pPr>
+      <w:r>
+        <w:t>Left: [2, 1]</w:t>
+      </w:r>
+    </w:p>
+    <w:p>
+      <w:pPr>
+        <w:pStyle w:val="ListParagraph"/>
+        <w:numPr>
+          <w:ilvl w:val="1"/>
+          <w:numId w:val="3"/>
+        </w:numPr>
+        <w:tabs>
+          <w:tab w:val="left" w:pos="1392"/>
+        </w:tabs>
+        <w:jc w:val="both"/>
+      </w:pPr>
+      <w:r>
+        <w:t>Right: [5]</w:t>
+      </w:r>
+    </w:p>
+    <w:p>
+      <w:pPr>
+        <w:pStyle w:val="ListParagraph"/>
+        <w:numPr>
+          <w:ilvl w:val="0"/>
+          <w:numId w:val="3"/>
+        </w:numPr>
+        <w:tabs>
+          <w:tab w:val="left" w:pos="1392"/>
+        </w:tabs>
+        <w:jc w:val="both"/>
+      </w:pPr>
+      <w:r>
+        <w:lastRenderedPageBreak/>
+        <w:t>Sort [2, 1]</w:t>
+      </w:r>
+    </w:p>
+    <w:p>
+      <w:pPr>
+        <w:pStyle w:val="ListParagraph"/>
+        <w:numPr>
+          <w:ilvl w:val="1"/>
+          <w:numId w:val="3"/>
+        </w:numPr>
+        <w:tabs>
+          <w:tab w:val="left" w:pos="1392"/>
+        </w:tabs>
+        <w:jc w:val="both"/>
+      </w:pPr>
+      <w:r>
+        <w:t>Pivot = 2</w:t>
+      </w:r>
+    </w:p>
+    <w:p>
+      <w:pPr>
+        <w:pStyle w:val="ListParagraph"/>
+        <w:numPr>
+          <w:ilvl w:val="1"/>
+          <w:numId w:val="3"/>
+        </w:numPr>
+        <w:tabs>
+          <w:tab w:val="left" w:pos="1392"/>
+        </w:tabs>
+        <w:jc w:val="both"/>
+      </w:pPr>
+      <w:r>
+        <w:t>Left: [1]</w:t>
+      </w:r>
+    </w:p>
+    <w:p>
+      <w:pPr>
+        <w:pStyle w:val="ListParagraph"/>
+        <w:numPr>
+          <w:ilvl w:val="1"/>
+          <w:numId w:val="3"/>
+        </w:numPr>
+        <w:tabs>
+          <w:tab w:val="left" w:pos="1392"/>
+        </w:tabs>
+        <w:jc w:val="both"/>
+      </w:pPr>
+      <w:r>
+        <w:t>Right: []</w:t>
+      </w:r>
+    </w:p>
+    <w:p>
+      <w:pPr>
+        <w:pStyle w:val="ListParagraph"/>
+        <w:numPr>
+          <w:ilvl w:val="0"/>
+          <w:numId w:val="3"/>
+        </w:numPr>
+        <w:tabs>
+          <w:tab w:val="left" w:pos="1392"/>
+        </w:tabs>
+        <w:jc w:val="both"/>
+      </w:pPr>
+      <w:r>
+        <w:t>s</w:t>
+      </w:r>
+      <w:r>
+        <w:t>ort right [8, 7]</w:t>
+      </w:r>
+    </w:p>
+    <w:p>
+      <w:pPr>
+        <w:pStyle w:val="ListParagraph"/>
+        <w:numPr>
+          <w:ilvl w:val="1"/>
+          <w:numId w:val="3"/>
+        </w:numPr>
+        <w:tabs>
+          <w:tab w:val="left" w:pos="1392"/>
+        </w:tabs>
+        <w:jc w:val="both"/>
+      </w:pPr>
+      <w:r>
+        <w:t>Pivot = 8</w:t>
+      </w:r>
+    </w:p>
+    <w:p>
+      <w:pPr>
+        <w:pStyle w:val="ListParagraph"/>
+        <w:numPr>
+          <w:ilvl w:val="1"/>
+          <w:numId w:val="3"/>
+        </w:numPr>
+        <w:tabs>
+          <w:tab w:val="left" w:pos="1392"/>
+        </w:tabs>
+        <w:jc w:val="both"/>
+      </w:pPr>
+      <w:r>
+        <w:t>Left: [7]</w:t>
+      </w:r>
+    </w:p>
+    <w:p>
+      <w:pPr>
+        <w:pStyle w:val="ListParagraph"/>
+        <w:numPr>
+          <w:ilvl w:val="1"/>
+          <w:numId w:val="3"/>
+        </w:numPr>
+        <w:tabs>
+          <w:tab w:val="left" w:pos="1392"/>
+        </w:tabs>
+        <w:jc w:val="both"/>
+      </w:pPr>
+      <w:r>
+        <w:t>Right: []</w:t>
+      </w:r>
+    </w:p>
+    <w:p>
+      <w:pPr>
+        <w:tabs>
+          <w:tab w:val="left" w:pos="1392"/>
+        </w:tabs>
+        <w:jc w:val="both"/>
+      </w:pPr>
+      <w:r>
+        <w:t xml:space="preserve">Final sorted </w:t>
+      </w:r>
+      <w:r>
+        <w:t>array: [</w:t>
+      </w:r>
+      <w:r>
+        <w:t>1, 2, 3, 5, 6, 7, 8]</w:t>
+      </w:r>
+    </w:p>
+    <w:p>
+      <w:pPr>
+        <w:tabs>
+          <w:tab w:val="left" w:pos="1392"/>
+        </w:tabs>
+        <w:jc w:val="both"/>
+      </w:pPr>
+    </w:p>
+    <w:p>
+      <w:pPr>
+        <w:tabs>
+          <w:tab w:val="left" w:pos="1392"/>
+        </w:tabs>
+        <w:jc w:val="both"/>
+      </w:pPr>
+      <w:r>
+        <w:t>P</w:t>
+      </w:r>
+      <w:r>
+        <w:t>ivots do not split perfectly evenly, but they also do not create the extreme imbalance</w:t>
+      </w:r>
+      <w:r>
+        <w:t>.</w:t>
+      </w:r>
+    </w:p>
+    <w:p>
+      <w:pPr>
+        <w:tabs>
+          <w:tab w:val="left" w:pos="1392"/>
+        </w:tabs>
+        <w:jc w:val="both"/>
+      </w:pPr>
+    </w:p>
+    <w:p>
+      <w:pPr>
+        <w:tabs>
+          <w:tab w:val="left" w:pos="1392"/>
+        </w:tabs>
+        <w:jc w:val="both"/>
+      </w:pPr>
+      <w:r>
+        <w:t>For the tracing examples, I used small inputs with around 6 elements to keep the steps easy to follow. I also chose simple numbers (</w:t>
+      </w:r>
+      <w:proofErr w:type="spellStart"/>
+      <w:r>
+        <w:t>most</w:t>
+      </w:r>
+      <w:r>
+        <w:t>t</w:t>
+      </w:r>
+      <w:r>
+        <w:t>ly</w:t>
+      </w:r>
+      <w:proofErr w:type="spellEnd"/>
+      <w:r>
+        <w:t xml:space="preserve"> between 1 and 8) so that the partitioning and swaps are easier to understand while tracing the algorithm manually</w:t>
+      </w:r>
+    </w:p>
+    <w:p>
+      <w:pPr>
+        <w:tabs>
+          <w:tab w:val="left" w:pos="1392"/>
+        </w:tabs>
+        <w:jc w:val="both"/>
+      </w:pPr>
+    </w:p>
+    <w:p>
+      <w:pPr>
+        <w:tabs>
+          <w:tab w:val="left" w:pos="1392"/>
+        </w:tabs>
+        <w:jc w:val="both"/>
+      </w:pPr>
+      <w:r>
+        <w:t xml:space="preserve">These visualizations helped me a lot to understand how quicksort really works- </w:t>
+      </w:r>
+      <w:hyperlink r:id="rId18" w:history="1">
+        <w:r>
+          <w:rPr>
+            <w:rStyle w:val="Hyperlink"/>
+          </w:rPr>
+          <w:t>quicksort</w:t>
+        </w:r>
+      </w:hyperlink>
+    </w:p>
+    <w:p>
+      <w:pPr>
+        <w:tabs>
+          <w:tab w:val="left" w:pos="1392"/>
+        </w:tabs>
+        <w:jc w:val="both"/>
+      </w:pPr>
+    </w:p>
+    <w:p>
+      <w:pPr>
+        <w:tabs>
+          <w:tab w:val="left" w:pos="1392"/>
+        </w:tabs>
+        <w:jc w:val="both"/>
+        <w:rPr>
+          <w:b/>
+          <w:bCs/>
+        </w:rPr>
+      </w:pPr>
+      <w:r>
+        <w:rPr>
+          <w:b/>
+          <w:bCs/>
+        </w:rPr>
+        <w:t>Problem 2: Randomized Quicksort Recurrence Relation</w:t>
+      </w:r>
+    </w:p>
+    <w:p>
+      <w:pPr>
+        <w:tabs>
+          <w:tab w:val="left" w:pos="1392"/>
+        </w:tabs>
+        <w:jc w:val="both"/>
+      </w:pPr>
+      <w:r>
+        <w:t>The recurrence relation for Randomized Quicksort depends on how the pivot divides the array. In the average case, the array is split into two roughly equal parts, giving the recurrence:</w:t>
+      </w:r>
+    </w:p>
+    <w:p>
+      <w:pPr>
+        <w:tabs>
+          <w:tab w:val="left" w:pos="1392"/>
+        </w:tabs>
+        <w:jc w:val="both"/>
+        <w:rPr>
+          <w:b/>
+          <w:bCs/>
+        </w:rPr>
+      </w:pPr>
+      <w:r>
+        <w:tab/>
+      </w:r>
+      <w:r>
+        <w:tab/>
+      </w:r>
+      <w:r>
+        <w:tab/>
+      </w:r>
+      <w:r>
+        <w:tab/>
+      </w:r>
+      <w:r>
+        <w:tab/>
+      </w:r>
+      <w:r>
+        <w:rPr>
+          <w:b/>
+          <w:bCs/>
+        </w:rPr>
+        <w:t>T(n)=2T(n/2) +O(n)</w:t>
+      </w:r>
+    </w:p>
+    <w:p>
+      <w:pPr>
+        <w:tabs>
+          <w:tab w:val="left" w:pos="1392"/>
+        </w:tabs>
+        <w:jc w:val="both"/>
+      </w:pPr>
+      <w:r>
+        <w:t>In the worst case, the pivot divides the array into very uneven parts (one side has</w:t>
+      </w:r>
+      <w:r>
+        <w:t xml:space="preserve"> n-1 </w:t>
+      </w:r>
+      <w:r>
+        <w:t>elements)</w:t>
+      </w:r>
+    </w:p>
+    <w:p>
+      <w:pPr>
+        <w:tabs>
+          <w:tab w:val="left" w:pos="1392"/>
+        </w:tabs>
+        <w:jc w:val="both"/>
+      </w:pPr>
+      <w:r>
+        <w:tab/>
+      </w:r>
+      <w:r>
+        <w:tab/>
+      </w:r>
+      <w:r>
+        <w:tab/>
+      </w:r>
+    </w:p>
+    <w:p>
+      <w:pPr>
+        <w:tabs>
+          <w:tab w:val="left" w:pos="1392"/>
+        </w:tabs>
+        <w:jc w:val="both"/>
+        <w:rPr>
+          <w:b/>
+          <w:bCs/>
+        </w:rPr>
+      </w:pPr>
+      <w:r>
+        <w:tab/>
+      </w:r>
+      <w:r>
+        <w:tab/>
+      </w:r>
+      <w:r>
+        <w:tab/>
+      </w:r>
+      <w:r>
+        <w:tab/>
+      </w:r>
+      <w:r>
+        <w:tab/>
+      </w:r>
+      <w:r>
+        <w:rPr>
+          <w:b/>
+          <w:bCs/>
+        </w:rPr>
+        <w:t>T(n)=T(n</w:t>
+      </w:r>
+      <w:r>
+        <w:rPr>
+          <w:b/>
+          <w:bCs/>
+        </w:rPr>
+        <w:t>-1</w:t>
+      </w:r>
+      <w:r>
+        <w:rPr>
+          <w:b/>
+          <w:bCs/>
+        </w:rPr>
+        <w:t>) +O(n)</w:t>
+      </w:r>
+    </w:p>
+    <w:p>
+      <w:pPr>
+        <w:tabs>
+          <w:tab w:val="left" w:pos="1392"/>
+        </w:tabs>
+        <w:jc w:val="both"/>
+      </w:pPr>
+      <w:r>
+        <w:t>In the best case, the array is perfectly balanced at each step, which is the same as the average case:</w:t>
+      </w:r>
+    </w:p>
+    <w:p>
+      <w:pPr>
+        <w:tabs>
+          <w:tab w:val="left" w:pos="1392"/>
+        </w:tabs>
+        <w:jc w:val="both"/>
+        <w:rPr>
+          <w:b/>
+          <w:bCs/>
+        </w:rPr>
+      </w:pPr>
+      <w:r>
+        <w:tab/>
+      </w:r>
+      <w:r>
+        <w:tab/>
+      </w:r>
+      <w:r>
+        <w:tab/>
+      </w:r>
+      <w:r>
+        <w:tab/>
+      </w:r>
+      <w:r>
+        <w:tab/>
+      </w:r>
+      <w:r>
+        <w:rPr>
+          <w:b/>
+          <w:bCs/>
+        </w:rPr>
+        <w:t>T(n)=2T(n/2) +O(n)</w:t>
+      </w:r>
+    </w:p>
+    <w:p>
+      <w:pPr>
+        <w:tabs>
+          <w:tab w:val="left" w:pos="1392"/>
+        </w:tabs>
+        <w:jc w:val="both"/>
+        <w:rPr>
+          <w:b/>
+          <w:bCs/>
+          <w:sz w:val="28"/>
+          <w:szCs w:val="28"/>
+        </w:rPr>
+      </w:pPr>
+      <w:r>
+        <w:rPr>
+          <w:b/>
+          <w:bCs/>
+          <w:sz w:val="28"/>
+          <w:szCs w:val="28"/>
+        </w:rPr>
+        <w:lastRenderedPageBreak/>
+        <w:t>Problem-3</w:t>
+      </w:r>
+      <w:r>
+        <w:rPr>
+          <w:b/>
+          <w:bCs/>
+          <w:sz w:val="28"/>
+          <w:szCs w:val="28"/>
+        </w:rPr>
+        <w:t xml:space="preserve"> Recursion</w:t>
+      </w:r>
+      <w:r>
+        <w:rPr>
+          <w:b/>
+          <w:bCs/>
+          <w:sz w:val="28"/>
+          <w:szCs w:val="28"/>
+        </w:rPr>
+        <w:t xml:space="preserve"> Tree and Solving the Recurrence</w:t>
+      </w:r>
+    </w:p>
+    <w:p>
+      <w:pPr>
+        <w:tabs>
+          <w:tab w:val="left" w:pos="1392"/>
+        </w:tabs>
+        <w:jc w:val="both"/>
+        <w:rPr>
+          <w:b/>
+          <w:bCs/>
+          <w:sz w:val="28"/>
+          <w:szCs w:val="28"/>
+        </w:rPr>
+      </w:pPr>
+    </w:p>
+    <w:p>
+      <w:pPr>
+        <w:tabs>
+          <w:tab w:val="left" w:pos="1392"/>
+        </w:tabs>
+        <w:jc w:val="both"/>
+      </w:pPr>
+      <w:r>
+        <w:t>For the average case, the recurrence is:</w:t>
+      </w:r>
+    </w:p>
+    <w:p>
+      <w:pPr>
+        <w:tabs>
+          <w:tab w:val="left" w:pos="1392"/>
+        </w:tabs>
+        <w:jc w:val="both"/>
+        <w:rPr>
+          <w:b/>
+          <w:bCs/>
+        </w:rPr>
+      </w:pPr>
+      <w:r>
+        <w:tab/>
+      </w:r>
+      <w:r>
+        <w:tab/>
+      </w:r>
+      <w:r>
+        <w:tab/>
+      </w:r>
+      <w:r>
+        <w:tab/>
+      </w:r>
+      <w:r>
+        <w:tab/>
+      </w:r>
+      <w:r>
+        <w:rPr>
+          <w:b/>
+          <w:bCs/>
+        </w:rPr>
+        <w:t>T(n)=2T(n/2) +O(n)</w:t>
+      </w:r>
+    </w:p>
+    <w:p>
+      <w:pPr>
+        <w:tabs>
+          <w:tab w:val="left" w:pos="1392"/>
+        </w:tabs>
+        <w:jc w:val="both"/>
+        <w:rPr>
+          <w:b/>
+          <w:bCs/>
+        </w:rPr>
+      </w:pPr>
+    </w:p>
+    <w:p>
+      <w:pPr>
+        <w:tabs>
+          <w:tab w:val="left" w:pos="1392"/>
+        </w:tabs>
+        <w:jc w:val="both"/>
+      </w:pPr>
+      <w:r>
+        <w:rPr>
+          <w:noProof/>
+        </w:rPr>
+        <mc:AlternateContent>
+          <mc:Choice Requires="wps">
+            <w:drawing>
+              <wp:anchor distT="0" distB="0" distL="114300" distR="114300" simplePos="0" relativeHeight="251671552" behindDoc="0" locked="0" layoutInCell="1" allowOverlap="1" wp14:anchorId="5804FF60" wp14:editId="5C19A4B8">
+                <wp:simplePos x="0" y="0"/>
+                <wp:positionH relativeFrom="column">
+                  <wp:posOffset>2019300</wp:posOffset>
+                </wp:positionH>
+                <wp:positionV relativeFrom="paragraph">
+                  <wp:posOffset>4545330</wp:posOffset>
+                </wp:positionV>
+                <wp:extent cx="1173480" cy="441960"/>
+                <wp:effectExtent l="0" t="0" r="26670" b="15240"/>
+                <wp:wrapNone/>
+                <wp:docPr id="581074033" name="Text Box 1"/>
+                <wp:cNvGraphicFramePr/>
+                <a:graphic xmlns:a="http://schemas.openxmlformats.org/drawingml/2006/main">
+                  <a:graphicData uri="http://schemas.microsoft.com/office/word/2010/wordprocessingShape">
+                    <wps:wsp>
+                      <wps:cNvSpPr txBox="1"/>
+                      <wps:spPr>
+                        <a:xfrm>
+                          <a:off x="0" y="0"/>
+                          <a:ext cx="1173480" cy="441960"/>
+                        </a:xfrm>
+                        <a:prstGeom prst="rect">
+                          <a:avLst/>
+                        </a:prstGeom>
+                        <a:solidFill>
+                          <a:schemeClr val="lt1"/>
+                        </a:solidFill>
+                        <a:ln w="6350">
+                          <a:solidFill>
+                            <a:schemeClr val="bg1"/>
+                          </a:solidFill>
+                        </a:ln>
+                      </wps:spPr>
+                      <wps:txbx>
+                        <w:txbxContent>
+                          <w:p>
+                            <w:r>
+                              <w:t>Recursion tree</w:t>
+                            </w:r>
+                          </w:p>
+                        </w:txbxContent>
+                      </wps:txbx>
+                      <wps:bodyPr rot="0" spcFirstLastPara="0" vertOverflow="overflow" horzOverflow="overflow" vert="horz" wrap="square" lIns="91440" tIns="45720" rIns="91440" bIns="45720" numCol="1" spcCol="0" rtlCol="0" fromWordArt="0" anchor="t" anchorCtr="0" forceAA="0" compatLnSpc="1">
+                        <a:prstTxWarp prst="textNoShape">
+                          <a:avLst/>
+                        </a:prstTxWarp>
+                        <a:noAutofit/>
+                      </wps:bodyPr>
+                    </wps:wsp>
+                  </a:graphicData>
+                </a:graphic>
+                <wp14:sizeRelH relativeFrom="margin">
+                  <wp14:pctWidth>0</wp14:pctWidth>
+                </wp14:sizeRelH>
+                <wp14:sizeRelV relativeFrom="margin">
+                  <wp14:pctHeight>0</wp14:pctHeight>
+                </wp14:sizeRelV>
+              </wp:anchor>
+            </w:drawing>
+          </mc:Choice>
+          <mc:Fallback>
+            <w:pict>
+              <v:shapetype w14:anchorId="5804FF60" id="_x0000_t202" coordsize="21600,21600" o:spt="202" path="m,l,21600r21600,l21600,xe">
+                <v:stroke joinstyle="miter"/>
+                <v:path gradientshapeok="t" o:connecttype="rect"/>
+              </v:shapetype>
+              <v:shape id="Text Box 1" o:spid="_x0000_s1026" type="#_x0000_t202" style="position:absolute;left:0;text-align:left;margin-left:159pt;margin-top:357.9pt;width:92.4pt;height:34.8pt;z-index:251671552;visibility:visible;mso-wrap-style:square;mso-width-percent:0;mso-height-percent:0;mso-wrap-distance-left:9pt;mso-wrap-distance-top:0;mso-wrap-distance-right:9pt;mso-wrap-distance-bottom:0;mso-position-horizontal:absolute;mso-position-horizontal-relative:text;mso-position-vertical:absolute;mso-position-vertical-relative:text;mso-width-percent:0;mso-height-percent:0;mso-width-relative:margin;mso-height-relative:margin;v-text-anchor:top" o:gfxdata="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" fillcolor="white [3201]" strokecolor="white [3212]" strokeweight=".5pt">
+                <v:textbox>
+                  <w:txbxContent>
+                    <w:p>
+                      <w:r>
+                        <w:t>Recursion tree</w:t>
+                      </w:r>
+                    </w:p>
+                  </w:txbxContent>
+                </v:textbox>
+              </v:shape>
+            </w:pict>
+          </mc:Fallback>
+        </mc:AlternateContent>
+      </w:r>
+      <w:r>
+        <w:drawing>
+          <wp:anchor distT="0" distB="0" distL="114300" distR="114300" simplePos="0" relativeHeight="251670528" behindDoc="0" locked="0" layoutInCell="1" allowOverlap="1" wp14:anchorId="2DA2EDC4" wp14:editId="7FADC595">
+            <wp:simplePos x="0" y="0"/>
+            <wp:positionH relativeFrom="column">
+              <wp:posOffset>0</wp:posOffset>
+            </wp:positionH>
+            <wp:positionV relativeFrom="paragraph">
+              <wp:posOffset>-3810</wp:posOffset>
+            </wp:positionV>
+            <wp:extent cx="5245373" cy="4366260"/>
+            <wp:effectExtent l="0" t="0" r="0" b="0"/>
+            <wp:wrapNone/>
+            <wp:docPr id="223987318" name="Picture 1"/>
+            <wp:cNvGraphicFramePr>
+              <a:graphicFrameLocks xmlns:a="http://schemas.openxmlformats.org/drawingml/2006/main" noChangeAspect="1"/>
+            </wp:cNvGraphicFramePr>
+            <a:graphic xmlns:a="http://schemas.openxmlformats.org/drawingml/2006/main">
+              <a:graphicData uri="http://schemas.openxmlformats.org/drawingml/2006/picture">
+                <pic:pic xmlns:pic="http://schemas.openxmlformats.org/drawingml/2006/picture">
+                  <pic:nvPicPr>
+                    <pic:cNvPr id="223987318" name=""/>
+                    <pic:cNvPicPr/>
+                  </pic:nvPicPr>
+                  <pic:blipFill>
+                    <a:blip r:embed="rId19">
+                      <a:extLst>
+                        <a:ext uri="{28A0092B-C50C-407E-A947-70E740481C1C}">
+                          <a14:useLocalDpi xmlns:a14="http://schemas.microsoft.com/office/drawing/2010/main" val="0"/>
+                        </a:ext>
+                      </a:extLst>
+                    </a:blip>
+                    <a:stretch>
+                      <a:fillRect/>
+                    </a:stretch>
+                  </pic:blipFill>
+                  <pic:spPr>
+                    <a:xfrm>
+                      <a:off x="0" y="0"/>
+                      <a:ext cx="5245373" cy="4366260"/>
+                    </a:xfrm>
+                    <a:prstGeom prst="rect">
+                      <a:avLst/>
+                    </a:prstGeom>
+                  </pic:spPr>
+                </pic:pic>
+              </a:graphicData>
+            </a:graphic>
+          </wp:anchor>
+        </w:drawing>
+      </w:r>
+    </w:p>
+    <w:p/>
+    <w:p/>
+    <w:p/>
+    <w:p/>
+    <w:p/>
+    <w:p/>
+    <w:p/>
+    <w:p/>
+    <w:p/>
+    <w:p/>
+    <w:p/>
+    <w:p/>
+    <w:p/>
+    <w:p/>
+    <w:p/>
+    <w:p>
+      <w:r>
+        <w:t xml:space="preserve">The recursion tree shows that the total work at each level remains </w:t>
+      </w:r>
+      <w:r>
+        <w:rPr>
+          <w:b/>
+          <w:bCs/>
+        </w:rPr>
+        <w:t>O(n)</w:t>
+      </w:r>
+      <w:r>
+        <w:t xml:space="preserve">, and since the height of the tree is </w:t>
+      </w:r>
+      <w:proofErr w:type="gramStart"/>
+      <w:r>
+        <w:t>log</w:t>
+      </w:r>
+      <w:proofErr w:type="gramEnd"/>
+      <w:r>
+        <w:t xml:space="preserve"> n, the overall time complexity is </w:t>
+      </w:r>
+      <w:r>
+        <w:rPr>
+          <w:b/>
+          <w:bCs/>
+        </w:rPr>
+        <w:t>O (</w:t>
+      </w:r>
+      <w:r>
+        <w:rPr>
+          <w:b/>
+          <w:bCs/>
+        </w:rPr>
+        <w:t>n log n).</w:t>
+      </w:r>
+    </w:p>
+    <w:p/>
+    <w:p>
+      <w:pPr>
+        <w:rPr>
+          <w:b/>
+          <w:bCs/>
+        </w:rPr>
+      </w:pPr>
+      <w:r>
+        <w:t xml:space="preserve">In the worst case, the recursion tree becomes a linear chain, leading to </w:t>
+      </w:r>
+      <w:r>
+        <w:rPr>
+          <w:b/>
+          <w:bCs/>
+        </w:rPr>
+        <w:t>T(n)=O(n^2)</w:t>
+      </w:r>
+    </w:p>
+    <w:p>
+      <w:pPr>
+        <w:rPr>
+          <w:b/>
+          <w:bCs/>
+        </w:rPr>
+      </w:pPr>
+    </w:p>
+    <w:p>
+      <w:pPr>
+        <w:rPr>
+          <w:b/>
+          <w:bCs/>
+        </w:rPr>
+      </w:pPr>
+      <w:r>
+        <w:rPr>
+          <w:b/>
+          <w:bCs/>
+        </w:rPr>
+        <w:lastRenderedPageBreak/>
+        <w:t xml:space="preserve">Problem 4: </w:t>
+      </w:r>
+      <w:r>
+        <w:rPr>
+          <w:b/>
+          <w:bCs/>
+        </w:rPr>
+        <w:t>Heapsort Tracing</w:t>
+      </w:r>
+    </w:p>
+    <w:p>
+      <w:r>
+        <w:t xml:space="preserve">For this trace, I used a small random input with 6 </w:t>
+      </w:r>
+      <w:proofErr w:type="gramStart"/>
+      <w:r>
+        <w:t>elements</w:t>
+      </w:r>
+      <w:proofErr w:type="gramEnd"/>
+      <w:r>
+        <w:t xml:space="preserve"> so the steps are easier to follow manually.</w:t>
+      </w:r>
+    </w:p>
+    <w:p>
+      <w:r>
+        <w:t>Input -</w:t>
+      </w:r>
+      <w:r>
+        <w:t xml:space="preserve"> </w:t>
+      </w:r>
+      <w:r>
+        <w:t>[4, 10, 3, 5, 1, 8]</w:t>
+      </w:r>
+    </w:p>
+    <w:p>
+      <w:pPr>
+        <w:rPr>
+          <w:b/>
+          <w:bCs/>
+        </w:rPr>
+      </w:pPr>
+      <w:r>
+        <w:rPr>
+          <w:b/>
+          <w:bCs/>
+        </w:rPr>
+        <w:t>Step-1</w:t>
+      </w:r>
+    </w:p>
+    <w:p>
+      <w:r>
+        <w:t>Array-</w:t>
+      </w:r>
+      <w:r>
+        <w:t xml:space="preserve"> [</w:t>
+      </w:r>
+      <w:r>
+        <w:t>4, 10, 3, 5, 1, 8]</w:t>
+      </w:r>
+    </w:p>
+    <w:p>
+      <w:proofErr w:type="spellStart"/>
+      <w:r>
+        <w:t>Heapify</w:t>
+      </w:r>
+      <w:proofErr w:type="spellEnd"/>
+      <w:r>
+        <w:t xml:space="preserve"> at index 2:</w:t>
+      </w:r>
+    </w:p>
+    <w:p>
+      <w:pPr>
+        <w:pStyle w:val="ListParagraph"/>
+        <w:numPr>
+          <w:ilvl w:val="0"/>
+          <w:numId w:val="4"/>
+        </w:numPr>
+      </w:pPr>
+      <w:r>
+        <w:t>Element = 3</w:t>
+      </w:r>
+    </w:p>
+    <w:p>
+      <w:pPr>
+        <w:pStyle w:val="ListParagraph"/>
+        <w:numPr>
+          <w:ilvl w:val="0"/>
+          <w:numId w:val="4"/>
+        </w:numPr>
+      </w:pPr>
+      <w:r>
+        <w:t>Left child = 8</w:t>
+      </w:r>
+    </w:p>
+    <w:p>
+      <w:pPr>
+        <w:pStyle w:val="ListParagraph"/>
+        <w:numPr>
+          <w:ilvl w:val="0"/>
+          <w:numId w:val="4"/>
+        </w:numPr>
+      </w:pPr>
+      <w:r>
+        <w:t>Right child does not exist</w:t>
+      </w:r>
+    </w:p>
+    <w:p>
+      <w:pPr>
+        <w:pStyle w:val="ListParagraph"/>
+        <w:numPr>
+          <w:ilvl w:val="0"/>
+          <w:numId w:val="4"/>
+        </w:numPr>
+      </w:pPr>
+      <w:r>
+        <w:t>Swap 3 and 8</w:t>
+      </w:r>
+    </w:p>
+    <w:p>
+      <w:r>
+        <w:t>Array now-</w:t>
+      </w:r>
+      <w:r>
+        <w:t xml:space="preserve"> </w:t>
+      </w:r>
+      <w:r>
+        <w:t>[4, 10, 8, 5, 1, 3]</w:t>
+      </w:r>
+    </w:p>
+    <w:p>
+      <w:proofErr w:type="spellStart"/>
+      <w:r>
+        <w:t>Heapify</w:t>
+      </w:r>
+      <w:proofErr w:type="spellEnd"/>
+      <w:r>
+        <w:t xml:space="preserve"> at index 1:</w:t>
+      </w:r>
+    </w:p>
+    <w:p>
+      <w:pPr>
+        <w:pStyle w:val="ListParagraph"/>
+        <w:numPr>
+          <w:ilvl w:val="0"/>
+          <w:numId w:val="4"/>
+        </w:numPr>
+      </w:pPr>
+      <w:r>
+        <w:t>Element = 10</w:t>
+      </w:r>
+    </w:p>
+    <w:p>
+      <w:pPr>
+        <w:pStyle w:val="ListParagraph"/>
+        <w:numPr>
+          <w:ilvl w:val="0"/>
+          <w:numId w:val="4"/>
+        </w:numPr>
+      </w:pPr>
+      <w:r>
+        <w:t>Children = 5 and 1</w:t>
+      </w:r>
+    </w:p>
+    <w:p>
+      <w:pPr>
+        <w:pStyle w:val="ListParagraph"/>
+        <w:numPr>
+          <w:ilvl w:val="0"/>
+          <w:numId w:val="4"/>
+        </w:numPr>
+      </w:pPr>
+      <w:r>
+        <w:t>10 is already the largest, so no change</w:t>
+      </w:r>
+    </w:p>
+    <w:p>
+      <w:r>
+        <w:t xml:space="preserve">Array after </w:t>
+      </w:r>
+      <w:proofErr w:type="spellStart"/>
+      <w:r>
+        <w:t>heapifying</w:t>
+      </w:r>
+      <w:proofErr w:type="spellEnd"/>
+      <w:r>
+        <w:t xml:space="preserve"> at index1-</w:t>
+      </w:r>
+      <w:r>
+        <w:t xml:space="preserve"> </w:t>
+      </w:r>
+      <w:r>
+        <w:t>[4, 10, 8, 5, 1, 3]</w:t>
+      </w:r>
+    </w:p>
+    <w:p>
+      <w:proofErr w:type="spellStart"/>
+      <w:r>
+        <w:t>Heapify</w:t>
+      </w:r>
+      <w:proofErr w:type="spellEnd"/>
+      <w:r>
+        <w:t xml:space="preserve"> at index 0:</w:t>
+      </w:r>
+    </w:p>
+    <w:p>
+      <w:pPr>
+        <w:pStyle w:val="ListParagraph"/>
+        <w:numPr>
+          <w:ilvl w:val="0"/>
+          <w:numId w:val="4"/>
+        </w:numPr>
+      </w:pPr>
+      <w:r>
+        <w:t>Element = 4</w:t>
+      </w:r>
+    </w:p>
+    <w:p>
+      <w:pPr>
+        <w:pStyle w:val="ListParagraph"/>
+        <w:numPr>
+          <w:ilvl w:val="0"/>
+          <w:numId w:val="4"/>
+        </w:numPr>
+      </w:pPr>
+      <w:r>
+        <w:t>Children = 10 and 8</w:t>
+      </w:r>
+    </w:p>
+    <w:p>
+      <w:pPr>
+        <w:pStyle w:val="ListParagraph"/>
+        <w:numPr>
+          <w:ilvl w:val="0"/>
+          <w:numId w:val="4"/>
+        </w:numPr>
+      </w:pPr>
+      <w:r>
+        <w:t>Swap 4 and 10</w:t>
+      </w:r>
+    </w:p>
+    <w:p>
+      <w:pPr>
+        <w:ind w:left="360"/>
+      </w:pPr>
+      <w:r>
+        <w:t xml:space="preserve">Array after </w:t>
+      </w:r>
+      <w:proofErr w:type="spellStart"/>
+      <w:r>
+        <w:t>heapifying</w:t>
+      </w:r>
+      <w:proofErr w:type="spellEnd"/>
+      <w:r>
+        <w:t xml:space="preserve"> at index0-</w:t>
+      </w:r>
+      <w:r>
+        <w:t xml:space="preserve"> </w:t>
+      </w:r>
+      <w:r>
+        <w:t>[10, 4, 8, 5, 1, 3]</w:t>
+      </w:r>
+    </w:p>
+    <w:p>
+      <w:pPr>
+        <w:ind w:left="360"/>
+      </w:pPr>
+    </w:p>
+    <w:p>
+      <w:pPr>
+        <w:ind w:left="360"/>
+      </w:pPr>
+      <w:r>
+        <w:t xml:space="preserve">Now </w:t>
+      </w:r>
+      <w:r>
+        <w:t xml:space="preserve">we </w:t>
+      </w:r>
+      <w:proofErr w:type="spellStart"/>
+      <w:r>
+        <w:t>heapify</w:t>
+      </w:r>
+      <w:proofErr w:type="spellEnd"/>
+      <w:r>
+        <w:t xml:space="preserve"> the affected subtree at index 1</w:t>
+      </w:r>
+    </w:p>
+    <w:p>
+      <w:pPr>
+        <w:pStyle w:val="ListParagraph"/>
+        <w:numPr>
+          <w:ilvl w:val="0"/>
+          <w:numId w:val="4"/>
+        </w:numPr>
+      </w:pPr>
+      <w:r>
+        <w:t>Element = 4</w:t>
+      </w:r>
+    </w:p>
+    <w:p>
+      <w:pPr>
+        <w:pStyle w:val="ListParagraph"/>
+        <w:numPr>
+          <w:ilvl w:val="0"/>
+          <w:numId w:val="4"/>
+        </w:numPr>
+      </w:pPr>
+      <w:r>
+        <w:t>Children = 5 and 1</w:t>
+      </w:r>
+    </w:p>
+    <w:p>
+      <w:pPr>
+        <w:pStyle w:val="ListParagraph"/>
+        <w:numPr>
+          <w:ilvl w:val="0"/>
+          <w:numId w:val="4"/>
+        </w:numPr>
+      </w:pPr>
+      <w:r>
+        <w:t>Swap 4 and 5</w:t>
+      </w:r>
+    </w:p>
+    <w:p>
+      <w:r>
+        <w:t xml:space="preserve">Array after </w:t>
+      </w:r>
+      <w:proofErr w:type="spellStart"/>
+      <w:r>
+        <w:t>heapifying</w:t>
+      </w:r>
+      <w:proofErr w:type="spellEnd"/>
+      <w:r>
+        <w:t xml:space="preserve"> the affected subtree-</w:t>
+      </w:r>
+      <w:r>
+        <w:t xml:space="preserve"> </w:t>
+      </w:r>
+      <w:r>
+        <w:t>[10, 5, 8, 4, 1, 3]</w:t>
+      </w:r>
+    </w:p>
+    <w:p/>
+    <w:p>
+      <w:pPr>
+        <w:rPr>
+          <w:b/>
+          <w:bCs/>
+        </w:rPr>
+      </w:pPr>
+      <w:r>
+        <w:rPr>
+          <w:b/>
+          <w:bCs/>
+        </w:rPr>
+        <w:lastRenderedPageBreak/>
+        <w:t>Step-2</w:t>
+      </w:r>
+    </w:p>
+    <w:p>
+      <w:r>
+        <w:t xml:space="preserve">Here we do a </w:t>
+      </w:r>
+      <w:r>
+        <w:t>full pass by moving the root to the end.</w:t>
+      </w:r>
+    </w:p>
+    <w:p>
+      <w:r>
+        <w:t>Swap first and last element:</w:t>
+      </w:r>
+    </w:p>
+    <w:p>
+      <w:r>
+        <w:t>[3, 5, 8, 4, 1, 10]</w:t>
+      </w:r>
+    </w:p>
+    <w:p/>
+    <w:p>
+      <w:r>
+        <w:t xml:space="preserve">Now </w:t>
+      </w:r>
+      <w:proofErr w:type="spellStart"/>
+      <w:r>
+        <w:t>heapify</w:t>
+      </w:r>
+      <w:proofErr w:type="spellEnd"/>
+      <w:r>
+        <w:t xml:space="preserve"> the reduced heap (size = 5):</w:t>
+      </w:r>
+    </w:p>
+    <w:p>
+      <w:pPr>
+        <w:pStyle w:val="ListParagraph"/>
+        <w:numPr>
+          <w:ilvl w:val="0"/>
+          <w:numId w:val="4"/>
+        </w:numPr>
+      </w:pPr>
+      <w:r>
+        <w:t>Element = 3</w:t>
+      </w:r>
+    </w:p>
+    <w:p>
+      <w:pPr>
+        <w:pStyle w:val="ListParagraph"/>
+        <w:numPr>
+          <w:ilvl w:val="0"/>
+          <w:numId w:val="4"/>
+        </w:numPr>
+      </w:pPr>
+      <w:r>
+        <w:t>Children = 5 and 8</w:t>
+      </w:r>
+    </w:p>
+    <w:p>
+      <w:pPr>
+        <w:pStyle w:val="ListParagraph"/>
+        <w:numPr>
+          <w:ilvl w:val="0"/>
+          <w:numId w:val="4"/>
+        </w:numPr>
+      </w:pPr>
+      <w:r>
+        <w:t>Swap 3 and 8</w:t>
+      </w:r>
+    </w:p>
+    <w:p>
+      <w:r>
+        <w:t>Array-</w:t>
+      </w:r>
+      <w:r>
+        <w:t xml:space="preserve"> </w:t>
+      </w:r>
+      <w:r>
+        <w:t>[8, 5, 3, 4, 1, 10]</w:t>
+      </w:r>
+    </w:p>
+    <w:p>
+      <w:r>
+        <w:t xml:space="preserve">Index 2 has no children in the reduced heap, so </w:t>
+      </w:r>
+      <w:proofErr w:type="spellStart"/>
+      <w:r>
+        <w:t>heapify</w:t>
+      </w:r>
+      <w:proofErr w:type="spellEnd"/>
+      <w:r>
+        <w:t xml:space="preserve"> stops</w:t>
+      </w:r>
+    </w:p>
+    <w:p/>
+    <w:p>
+      <w:r>
+        <w:t>Finally a</w:t>
+      </w:r>
+      <w:r>
+        <w:t>rray after one full heapsort pass:</w:t>
+      </w:r>
+    </w:p>
+    <w:p/>
+    <w:p>
+      <w:r>
+        <w:t>[8, 5, 3, 4, 1, 10]</w:t>
+      </w:r>
+    </w:p>
+    <w:p/>
+    <w:p>
+      <w:r>
+        <w:t>F</w:t>
+      </w:r>
+      <w:r>
+        <w:t xml:space="preserve">or the input array </w:t>
+      </w:r>
+      <w:r>
+        <w:rPr>
+          <w:b/>
+          <w:bCs/>
+        </w:rPr>
+        <w:t>[4, 10, 3, 5, 1, 8]</w:t>
+      </w:r>
+      <w:r>
+        <w:t xml:space="preserve">, after building the max heap, the largest element (10) is moved to the end in the first pass. To fully sort the array, this process needs to be repeated for the remaining elements, reducing the heap size each time. Since the array has 6 elements, it would take 5 passes in total to completely sort </w:t>
+      </w:r>
+      <w:r>
+        <w:t>it out.</w:t>
+      </w:r>
+    </w:p>
+    <w:p/>
+    <w:p/>
+    <w:p/>
+    <w:p/>
+    <w:p/>
+    <w:p/>
+    <w:p/>
+    <w:p>
+      <w:r>
+        <w:lastRenderedPageBreak/>
+        <w:t>Citations</w:t>
+      </w:r>
+    </w:p>
+    <w:p/>
+    <w:p>
+      <w:pPr>
+        <w:pStyle w:val="ListParagraph"/>
+        <w:numPr>
+          <w:ilvl w:val="0"/>
+          <w:numId w:val="5"/>
+        </w:numPr>
+      </w:pPr>
+      <w:r>
+        <w:t>Mostly used the lecture slides to understand how heap sort and quick sort works</w:t>
+      </w:r>
+    </w:p>
+    <w:p>
+      <w:pPr>
+        <w:pStyle w:val="ListParagraph"/>
+        <w:numPr>
+          <w:ilvl w:val="0"/>
+          <w:numId w:val="5"/>
+        </w:numPr>
+      </w:pPr>
+      <w:r>
+        <w:t>Visualizations</w:t>
+      </w:r>
+    </w:p>
+    <w:p>
+      <w:pPr>
+        <w:pStyle w:val="ListParagraph"/>
+        <w:numPr>
+          <w:ilvl w:val="1"/>
+          <w:numId w:val="5"/>
+        </w:numPr>
+      </w:pPr>
+      <w:hyperlink r:id="rId20" w:history="1">
+        <w:r>
+          <w:rPr>
+            <w:rStyle w:val="Hyperlink"/>
+          </w:rPr>
+          <w:t>https://www.cs.usfca.edu/~galles/visualization/HeapSort.html</w:t>
+        </w:r>
+      </w:hyperlink>
+    </w:p>
+    <w:p>
+      <w:pPr>
+        <w:pStyle w:val="ListParagraph"/>
+        <w:numPr>
+          <w:ilvl w:val="1"/>
+          <w:numId w:val="5"/>
+        </w:numPr>
+      </w:pPr>
+      <w:hyperlink r:id="rId21" w:history="1">
+        <w:r>
+          <w:rPr>
+            <w:rStyle w:val="Hyperlink"/>
+          </w:rPr>
+          <w:t>https://www.hackerearth.com/practice/algorithms/sorting/quick-sort/visualize/</w:t>
+        </w:r>
+      </w:hyperlink>
+    </w:p>
+    <w:p>
+      <w:pPr>
+        <w:pStyle w:val="ListParagraph"/>
+        <w:numPr>
+          <w:ilvl w:val="0"/>
+          <w:numId w:val="5"/>
+        </w:numPr>
+      </w:pPr>
+      <w:hyperlink r:id="rId22" w:history="1">
+        <w:r>
+          <w:rPr>
+            <w:rStyle w:val="Hyperlink"/>
+          </w:rPr>
+          <w:t>https://heapsortvisualizer.web.app/</w:t>
+        </w:r>
+      </w:hyperlink>
+    </w:p>
+    <w:p>
+      <w:pPr>
+        <w:pStyle w:val="ListParagraph"/>
+        <w:numPr>
+          <w:ilvl w:val="0"/>
+          <w:numId w:val="5"/>
+        </w:numPr>
+      </w:pPr>
+      <w:hyperlink r:id="rId23" w:history="1">
+        <w:r>
+          <w:rPr>
+            <w:rStyle w:val="Hyperlink"/>
+          </w:rPr>
+          <w:t>https://www.geeksforgeeks.org/dsa/quick-sort-algorithm/</w:t>
+        </w:r>
+      </w:hyperlink>
+    </w:p>
+    <w:p>
+      <w:pPr>
+        <w:pStyle w:val="ListParagraph"/>
+        <w:numPr>
+          <w:ilvl w:val="0"/>
+          <w:numId w:val="5"/>
+        </w:numPr>
+      </w:pPr>
+      <w:hyperlink r:id="rId24" w:history="1">
+        <w:r>
+          <w:rPr>
+            <w:rStyle w:val="Hyperlink"/>
+          </w:rPr>
+          <w:t>https://www.math.umd.edu/~immortal/CMSC351/notes/quicksort.pdf</w:t>
+        </w:r>
+      </w:hyperlink>
+    </w:p>
+    <w:p>
+      <w:pPr>
+        <w:pStyle w:val="ListParagraph"/>
+        <w:numPr>
+          <w:ilvl w:val="0"/>
+          <w:numId w:val="5"/>
+        </w:numPr>
+      </w:pPr>
+      <w:hyperlink r:id="rId25" w:history="1">
+        <w:r>
+          <w:rPr>
+            <w:rStyle w:val="Hyperlink"/>
+          </w:rPr>
+          <w:t>https://opendsa-server.cs.vt.edu/ODSA/Books/Everything/html/Heapsort.html</w:t>
+        </w:r>
+      </w:hyperlink>
+    </w:p>
+    <w:p>
+      <w:pPr>
+        <w:pStyle w:val="ListParagraph"/>
+        <w:numPr>
+          <w:ilvl w:val="0"/>
+          <w:numId w:val="5"/>
+        </w:numPr>
+      </w:pPr>
+      <w:r>
+        <w:t>Videos</w:t>
+      </w:r>
+    </w:p>
+    <w:p>
+      <w:pPr>
+        <w:pStyle w:val="ListParagraph"/>
+        <w:numPr>
+          <w:ilvl w:val="1"/>
+          <w:numId w:val="5"/>
+        </w:numPr>
+      </w:pPr>
+      <w:hyperlink r:id="rId26" w:history="1">
+        <w:r>
+          <w:rPr>
+            <w:rStyle w:val="Hyperlink"/>
+          </w:rPr>
+          <w:t>https://www.youtube.com/watch?v=Q1yi1eaqN7I</w:t>
+        </w:r>
+      </w:hyperlink>
+    </w:p>
+    <w:p>
+      <w:pPr>
+        <w:pStyle w:val="ListParagraph"/>
+        <w:numPr>
+          <w:ilvl w:val="1"/>
+          <w:numId w:val="5"/>
+        </w:numPr>
+      </w:pPr>
+      <w:hyperlink r:id="rId27" w:history="1">
+        <w:r>
+          <w:rPr>
+            <w:rStyle w:val="Hyperlink"/>
+          </w:rPr>
+          <w:t>https://www.youtube.com/watch?v=Vtckgz38QHs</w:t>
+        </w:r>
+      </w:hyperlink>
+    </w:p>
+    <w:p>
+      <w:pPr>
+        <w:pStyle w:val="ListParagraph"/>
+        <w:numPr>
+          <w:ilvl w:val="1"/>
+          <w:numId w:val="5"/>
+        </w:numPr>
+      </w:pPr>
+      <w:hyperlink r:id="rId28" w:history="1">
+        <w:r>
+          <w:rPr>
+            <w:rStyle w:val="Hyperlink"/>
+          </w:rPr>
+          <w:t>https://www.youtube.com/watch?v=Hoixgm4-P4M</w:t>
+        </w:r>
+      </w:hyperlink>
+      <w:r>
+        <w:t xml:space="preserve"> (</w:t>
+      </w:r>
+      <w:proofErr w:type="spellStart"/>
+      <w:r>
+        <w:t>favourite</w:t>
+      </w:r>
+      <w:proofErr w:type="spellEnd"/>
+      <w:r>
+        <w:t>)</w:t>
+      </w:r>
+    </w:p>
+    <w:p>
+      <w:pPr>
+        <w:pStyle w:val="ListParagraph"/>
+        <w:numPr>
+          <w:ilvl w:val="1"/>
+          <w:numId w:val="5"/>
+        </w:numPr>
+      </w:pPr>
+      <w:hyperlink r:id="rId29" w:history="1">
+        <w:r>
+          <w:rPr>
+            <w:rStyle w:val="Hyperlink"/>
+          </w:rPr>
+          <w:t>https://www.youtube.com/watch?v=2DmK_H7IdTo</w:t>
+        </w:r>
+      </w:hyperlink>
+      <w:r>
+        <w:t xml:space="preserve"> </w:t>
+      </w:r>
+    </w:p>
+    <w:p>
+      <w:pPr>
+        <w:pStyle w:val="ListParagraph"/>
+        <w:numPr>
+          <w:ilvl w:val="0"/>
+          <w:numId w:val="5"/>
+        </w:numPr>
+      </w:pPr>
+      <w:hyperlink r:id="rId30" w:history="1">
+        <w:r>
+          <w:rPr>
+            <w:rStyle w:val="Hyperlink"/>
+          </w:rPr>
+          <w:t>https://www.geeksforgeeks.org/dsa/time-and-space-complexity-analysis-of-quick-sort/</w:t>
+        </w:r>
+      </w:hyperlink>
+    </w:p>
+    <w:p>
+      <w:pPr>
+        <w:pStyle w:val="ListParagraph"/>
+        <w:numPr>
+          <w:ilvl w:val="0"/>
+          <w:numId w:val="5"/>
+        </w:numPr>
+      </w:pPr>
+      <w:hyperlink r:id="rId31" w:history="1">
+        <w:r>
+          <w:rPr>
+            <w:rStyle w:val="Hyperlink"/>
+          </w:rPr>
+          <w:t>https://en.wikipedia.org/wiki/Quicksort</w:t>
+        </w:r>
+      </w:hyperlink>
+    </w:p>
+    <w:p>
+      <w:pPr>
+        <w:pStyle w:val="ListParagraph"/>
+        <w:numPr>
+          <w:ilvl w:val="0"/>
+          <w:numId w:val="5"/>
+        </w:numPr>
+      </w:pPr>
+      <w:hyperlink r:id="rId32" w:history="1">
+        <w:r>
+          <w:rPr>
+            <w:rStyle w:val="Hyperlink"/>
+          </w:rPr>
+          <w:t>https://www.w3schools.com/dsa/dsa_algo_quicksort.php</w:t>
+        </w:r>
+      </w:hyperlink>
+    </w:p>
+    <w:p>
+      <w:pPr>
+        <w:pStyle w:val="ListParagraph"/>
+        <w:numPr>
+          <w:ilvl w:val="0"/>
+          <w:numId w:val="5"/>
+        </w:numPr>
+      </w:pPr>
+      <w:r>
+        <w:t>AI Usage – ChatGPT was used to understand upload lecture notes understand concepts better and validate my understanding, while also checking if my approach and solutions were valid.</w:t>
+      </w:r>
+    </w:p>
     <w:sectPr>
       <w:pgSz w:w="12240" w:h="15840"/>
       <w:pgMar w:top="1440" w:right="1440" w:bottom="1440" w:left="1440" w:header="720" w:footer="720" w:gutter="0"/>
@@ -2552,6 +5068,495 @@
     </w:p>
   </w:footnote>
 </w:footnotes>
+</file>
+
+<file path=word/numbering.xml><?xml version="1.0" encoding="utf-8"?>
+<w:numbering xmlns:wpc="http://schemas.microsoft.com/office/word/2010/wordprocessingCanvas" xmlns:cx="http://schemas.microsoft.com/office/drawing/2014/chartex" xmlns:cx1="http://schemas.microsoft.com/office/drawing/2015/9/8/chartex" xmlns:cx2="http://schemas.microsoft.com/office/drawing/2015/10/21/chartex" xmlns:cx3="http://schemas.microsoft.com/office/drawing/2016/5/9/chartex" xmlns:cx4="http://schemas.microsoft.com/office/drawing/2016/5/10/chartex" xmlns:cx5="http://schemas.microsoft.com/office/drawing/2016/5/11/chartex" xmlns:cx6="http://schemas.microsoft.com/office/drawing/2016/5/12/chartex" xmlns:cx7="http://schemas.microsoft.com/office/drawing/2016/5/13/chartex" xmlns:cx8="http://schemas.microsoft.com/office/drawing/2016/5/14/chartex" xmlns:mc="http://schemas.openxmlformats.org/markup-compatibility/2006" xmlns:aink="http://schemas.microsoft.com/office/drawing/2016/ink" xmlns:am3d="http://schemas.microsoft.com/office/drawing/2017/model3d" xmlns:o="urn:schemas-microsoft-com:office:office" xmlns:oel="http://schemas.microsoft.com/office/2019/extlst" xmlns:r="http://schemas.openxmlformats.org/officeDocument/2006/relationships" xmlns:m="http://schemas.openxmlformats.org/officeDocument/2006/math" xmlns:v="urn:schemas-microsoft-com:vml" xmlns:wp14="http://schemas.microsoft.com/office/word/2010/wordprocessingDrawing" xmlns:wp="http://schemas.openxmlformats.org/drawingml/2006/wordprocessingDrawing" xmlns:w10="urn:schemas-microsoft-com:office:word" xmlns:w="http://schemas.openxmlformats.org/wordprocessingml/2006/main" xmlns:w14="http://schemas.microsoft.com/office/word/2010/wordml" xmlns:w15="http://schemas.microsoft.com/office/word/2012/wordml" xmlns:w16cex="http://schemas.microsoft.com/office/word/2018/wordml/cex" xmlns:w16cid="http://schemas.microsoft.com/office/word/2016/wordml/cid" xmlns:w16="http://schemas.microsoft.com/office/word/2018/wordml" xmlns:w16du="http://schemas.microsoft.com/office/word/2023/wordml/word16du" xmlns:w16sdtdh="http://schemas.microsoft.com/office/word/2020/wordml/sdtdatahash" xmlns:w16sdtfl="http://schemas.microsoft.com/office/word/2024/wordml/sdtformatlock" xmlns:w16se="http://schemas.microsoft.com/office/word/2015/wordml/symex" xmlns:wpg="http://schemas.microsoft.com/office/word/2010/wordprocessingGroup" xmlns:wpi="http://schemas.microsoft.com/office/word/2010/wordprocessingInk" xmlns:wne="http://schemas.microsoft.com/office/word/2006/wordml" xmlns:wps="http://schemas.microsoft.com/office/word/2010/wordprocessingShape" mc:Ignorable="w14 w15 w16se w16cid w16 w16cex w16sdtdh w16sdtfl w16du wp14">
+  <w:abstractNum w:abstractNumId="0" w15:restartNumberingAfterBreak="0">
+    <w:nsid w:val="0ACE334B"/>
+    <w:multiLevelType w:val="hybridMultilevel"/>
+    <w:tmpl w:val="7DA8071A"/>
+    <w:lvl w:ilvl="0" w:tplc="04090011">
+      <w:start w:val="1"/>
+      <w:numFmt w:val="decimal"/>
+      <w:lvlText w:val="%1)"/>
+      <w:lvlJc w:val="left"/>
+      <w:pPr>
+        <w:ind w:left="720" w:hanging="360"/>
+      </w:pPr>
+      <w:rPr>
+        <w:rFonts w:hint="default"/>
+      </w:rPr>
+    </w:lvl>
+    <w:lvl w:ilvl="1" w:tplc="04090019">
+      <w:start w:val="1"/>
+      <w:numFmt w:val="lowerLetter"/>
+      <w:lvlText w:val="%2."/>
+      <w:lvlJc w:val="left"/>
+      <w:pPr>
+        <w:ind w:left="1440" w:hanging="360"/>
+      </w:pPr>
+    </w:lvl>
+    <w:lvl w:ilvl="2" w:tplc="0409001B" w:tentative="1">
+      <w:start w:val="1"/>
+      <w:numFmt w:val="lowerRoman"/>
+      <w:lvlText w:val="%3."/>
+      <w:lvlJc w:val="right"/>
+      <w:pPr>
+        <w:ind w:left="2160" w:hanging="180"/>
+      </w:pPr>
+    </w:lvl>
+    <w:lvl w:ilvl="3" w:tplc="0409000F" w:tentative="1">
+      <w:start w:val="1"/>
+      <w:numFmt w:val="decimal"/>
+      <w:lvlText w:val="%4."/>
+      <w:lvlJc w:val="left"/>
+      <w:pPr>
+        <w:ind w:left="2880" w:hanging="360"/>
+      </w:pPr>
+    </w:lvl>
+    <w:lvl w:ilvl="4" w:tplc="04090019" w:tentative="1">
+      <w:start w:val="1"/>
+      <w:numFmt w:val="lowerLetter"/>
+      <w:lvlText w:val="%5."/>
+      <w:lvlJc w:val="left"/>
+      <w:pPr>
+        <w:ind w:left="3600" w:hanging="360"/>
+      </w:pPr>
+    </w:lvl>
+    <w:lvl w:ilvl="5" w:tplc="0409001B" w:tentative="1">
+      <w:start w:val="1"/>
+      <w:numFmt w:val="lowerRoman"/>
+      <w:lvlText w:val="%6."/>
+      <w:lvlJc w:val="right"/>
+      <w:pPr>
+        <w:ind w:left="4320" w:hanging="180"/>
+      </w:pPr>
+    </w:lvl>
+    <w:lvl w:ilvl="6" w:tplc="0409000F" w:tentative="1">
+      <w:start w:val="1"/>
+      <w:numFmt w:val="decimal"/>
+      <w:lvlText w:val="%7."/>
+      <w:lvlJc w:val="left"/>
+      <w:pPr>
+        <w:ind w:left="5040" w:hanging="360"/>
+      </w:pPr>
+    </w:lvl>
+    <w:lvl w:ilvl="7" w:tplc="04090019" w:tentative="1">
+      <w:start w:val="1"/>
+      <w:numFmt w:val="lowerLetter"/>
+      <w:lvlText w:val="%8."/>
+      <w:lvlJc w:val="left"/>
+      <w:pPr>
+        <w:ind w:left="5760" w:hanging="360"/>
+      </w:pPr>
+    </w:lvl>
+    <w:lvl w:ilvl="8" w:tplc="0409001B" w:tentative="1">
+      <w:start w:val="1"/>
+      <w:numFmt w:val="lowerRoman"/>
+      <w:lvlText w:val="%9."/>
+      <w:lvlJc w:val="right"/>
+      <w:pPr>
+        <w:ind w:left="6480" w:hanging="180"/>
+      </w:pPr>
+    </w:lvl>
+  </w:abstractNum>
+  <w:abstractNum w:abstractNumId="1" w15:restartNumberingAfterBreak="0">
+    <w:nsid w:val="1F012C62"/>
+    <w:multiLevelType w:val="hybridMultilevel"/>
+    <w:tmpl w:val="53988732"/>
+    <w:lvl w:ilvl="0" w:tplc="04090011">
+      <w:start w:val="1"/>
+      <w:numFmt w:val="decimal"/>
+      <w:lvlText w:val="%1)"/>
+      <w:lvlJc w:val="left"/>
+      <w:pPr>
+        <w:ind w:left="720" w:hanging="360"/>
+      </w:pPr>
+      <w:rPr>
+        <w:rFonts w:hint="default"/>
+      </w:rPr>
+    </w:lvl>
+    <w:lvl w:ilvl="1" w:tplc="04090019">
+      <w:start w:val="1"/>
+      <w:numFmt w:val="lowerLetter"/>
+      <w:lvlText w:val="%2."/>
+      <w:lvlJc w:val="left"/>
+      <w:pPr>
+        <w:ind w:left="1440" w:hanging="360"/>
+      </w:pPr>
+    </w:lvl>
+    <w:lvl w:ilvl="2" w:tplc="0409001B" w:tentative="1">
+      <w:start w:val="1"/>
+      <w:numFmt w:val="lowerRoman"/>
+      <w:lvlText w:val="%3."/>
+      <w:lvlJc w:val="right"/>
+      <w:pPr>
+        <w:ind w:left="2160" w:hanging="180"/>
+      </w:pPr>
+    </w:lvl>
+    <w:lvl w:ilvl="3" w:tplc="0409000F" w:tentative="1">
+      <w:start w:val="1"/>
+      <w:numFmt w:val="decimal"/>
+      <w:lvlText w:val="%4."/>
+      <w:lvlJc w:val="left"/>
+      <w:pPr>
+        <w:ind w:left="2880" w:hanging="360"/>
+      </w:pPr>
+    </w:lvl>
+    <w:lvl w:ilvl="4" w:tplc="04090019" w:tentative="1">
+      <w:start w:val="1"/>
+      <w:numFmt w:val="lowerLetter"/>
+      <w:lvlText w:val="%5."/>
+      <w:lvlJc w:val="left"/>
+      <w:pPr>
+        <w:ind w:left="3600" w:hanging="360"/>
+      </w:pPr>
+    </w:lvl>
+    <w:lvl w:ilvl="5" w:tplc="0409001B" w:tentative="1">
+      <w:start w:val="1"/>
+      <w:numFmt w:val="lowerRoman"/>
+      <w:lvlText w:val="%6."/>
+      <w:lvlJc w:val="right"/>
+      <w:pPr>
+        <w:ind w:left="4320" w:hanging="180"/>
+      </w:pPr>
+    </w:lvl>
+    <w:lvl w:ilvl="6" w:tplc="0409000F" w:tentative="1">
+      <w:start w:val="1"/>
+      <w:numFmt w:val="decimal"/>
+      <w:lvlText w:val="%7."/>
+      <w:lvlJc w:val="left"/>
+      <w:pPr>
+        <w:ind w:left="5040" w:hanging="360"/>
+      </w:pPr>
+    </w:lvl>
+    <w:lvl w:ilvl="7" w:tplc="04090019" w:tentative="1">
+      <w:start w:val="1"/>
+      <w:numFmt w:val="lowerLetter"/>
+      <w:lvlText w:val="%8."/>
+      <w:lvlJc w:val="left"/>
+      <w:pPr>
+        <w:ind w:left="5760" w:hanging="360"/>
+      </w:pPr>
+    </w:lvl>
+    <w:lvl w:ilvl="8" w:tplc="0409001B" w:tentative="1">
+      <w:start w:val="1"/>
+      <w:numFmt w:val="lowerRoman"/>
+      <w:lvlText w:val="%9."/>
+      <w:lvlJc w:val="right"/>
+      <w:pPr>
+        <w:ind w:left="6480" w:hanging="180"/>
+      </w:pPr>
+    </w:lvl>
+  </w:abstractNum>
+  <w:abstractNum w:abstractNumId="2" w15:restartNumberingAfterBreak="0">
+    <w:nsid w:val="5BF930B0"/>
+    <w:multiLevelType w:val="hybridMultilevel"/>
+    <w:tmpl w:val="B0D66D90"/>
+    <w:lvl w:ilvl="0" w:tplc="04090011">
+      <w:start w:val="1"/>
+      <w:numFmt w:val="decimal"/>
+      <w:lvlText w:val="%1)"/>
+      <w:lvlJc w:val="left"/>
+      <w:pPr>
+        <w:ind w:left="720" w:hanging="360"/>
+      </w:pPr>
+      <w:rPr>
+        <w:rFonts w:hint="default"/>
+      </w:rPr>
+    </w:lvl>
+    <w:lvl w:ilvl="1" w:tplc="04090019">
+      <w:start w:val="1"/>
+      <w:numFmt w:val="lowerLetter"/>
+      <w:lvlText w:val="%2."/>
+      <w:lvlJc w:val="left"/>
+      <w:pPr>
+        <w:ind w:left="1440" w:hanging="360"/>
+      </w:pPr>
+    </w:lvl>
+    <w:lvl w:ilvl="2" w:tplc="0409001B" w:tentative="1">
+      <w:start w:val="1"/>
+      <w:numFmt w:val="lowerRoman"/>
+      <w:lvlText w:val="%3."/>
+      <w:lvlJc w:val="right"/>
+      <w:pPr>
+        <w:ind w:left="2160" w:hanging="180"/>
+      </w:pPr>
+    </w:lvl>
+    <w:lvl w:ilvl="3" w:tplc="0409000F" w:tentative="1">
+      <w:start w:val="1"/>
+      <w:numFmt w:val="decimal"/>
+      <w:lvlText w:val="%4."/>
+      <w:lvlJc w:val="left"/>
+      <w:pPr>
+        <w:ind w:left="2880" w:hanging="360"/>
+      </w:pPr>
+    </w:lvl>
+    <w:lvl w:ilvl="4" w:tplc="04090019" w:tentative="1">
+      <w:start w:val="1"/>
+      <w:numFmt w:val="lowerLetter"/>
+      <w:lvlText w:val="%5."/>
+      <w:lvlJc w:val="left"/>
+      <w:pPr>
+        <w:ind w:left="3600" w:hanging="360"/>
+      </w:pPr>
+    </w:lvl>
+    <w:lvl w:ilvl="5" w:tplc="0409001B" w:tentative="1">
+      <w:start w:val="1"/>
+      <w:numFmt w:val="lowerRoman"/>
+      <w:lvlText w:val="%6."/>
+      <w:lvlJc w:val="right"/>
+      <w:pPr>
+        <w:ind w:left="4320" w:hanging="180"/>
+      </w:pPr>
+    </w:lvl>
+    <w:lvl w:ilvl="6" w:tplc="0409000F" w:tentative="1">
+      <w:start w:val="1"/>
+      <w:numFmt w:val="decimal"/>
+      <w:lvlText w:val="%7."/>
+      <w:lvlJc w:val="left"/>
+      <w:pPr>
+        <w:ind w:left="5040" w:hanging="360"/>
+      </w:pPr>
+    </w:lvl>
+    <w:lvl w:ilvl="7" w:tplc="04090019" w:tentative="1">
+      <w:start w:val="1"/>
+      <w:numFmt w:val="lowerLetter"/>
+      <w:lvlText w:val="%8."/>
+      <w:lvlJc w:val="left"/>
+      <w:pPr>
+        <w:ind w:left="5760" w:hanging="360"/>
+      </w:pPr>
+    </w:lvl>
+    <w:lvl w:ilvl="8" w:tplc="0409001B" w:tentative="1">
+      <w:start w:val="1"/>
+      <w:numFmt w:val="lowerRoman"/>
+      <w:lvlText w:val="%9."/>
+      <w:lvlJc w:val="right"/>
+      <w:pPr>
+        <w:ind w:left="6480" w:hanging="180"/>
+      </w:pPr>
+    </w:lvl>
+  </w:abstractNum>
+  <w:abstractNum w:abstractNumId="3" w15:restartNumberingAfterBreak="0">
+    <w:nsid w:val="6E451AE1"/>
+    <w:multiLevelType w:val="hybridMultilevel"/>
+    <w:tmpl w:val="509A8968"/>
+    <w:lvl w:ilvl="0" w:tplc="04090011">
+      <w:start w:val="1"/>
+      <w:numFmt w:val="decimal"/>
+      <w:lvlText w:val="%1)"/>
+      <w:lvlJc w:val="left"/>
+      <w:pPr>
+        <w:ind w:left="720" w:hanging="360"/>
+      </w:pPr>
+      <w:rPr>
+        <w:rFonts w:hint="default"/>
+      </w:rPr>
+    </w:lvl>
+    <w:lvl w:ilvl="1" w:tplc="04090019">
+      <w:start w:val="1"/>
+      <w:numFmt w:val="lowerLetter"/>
+      <w:lvlText w:val="%2."/>
+      <w:lvlJc w:val="left"/>
+      <w:pPr>
+        <w:ind w:left="1440" w:hanging="360"/>
+      </w:pPr>
+    </w:lvl>
+    <w:lvl w:ilvl="2" w:tplc="0409001B" w:tentative="1">
+      <w:start w:val="1"/>
+      <w:numFmt w:val="lowerRoman"/>
+      <w:lvlText w:val="%3."/>
+      <w:lvlJc w:val="right"/>
+      <w:pPr>
+        <w:ind w:left="2160" w:hanging="180"/>
+      </w:pPr>
+    </w:lvl>
+    <w:lvl w:ilvl="3" w:tplc="0409000F" w:tentative="1">
+      <w:start w:val="1"/>
+      <w:numFmt w:val="decimal"/>
+      <w:lvlText w:val="%4."/>
+      <w:lvlJc w:val="left"/>
+      <w:pPr>
+        <w:ind w:left="2880" w:hanging="360"/>
+      </w:pPr>
+    </w:lvl>
+    <w:lvl w:ilvl="4" w:tplc="04090019" w:tentative="1">
+      <w:start w:val="1"/>
+      <w:numFmt w:val="lowerLetter"/>
+      <w:lvlText w:val="%5."/>
+      <w:lvlJc w:val="left"/>
+      <w:pPr>
+        <w:ind w:left="3600" w:hanging="360"/>
+      </w:pPr>
+    </w:lvl>
+    <w:lvl w:ilvl="5" w:tplc="0409001B" w:tentative="1">
+      <w:start w:val="1"/>
+      <w:numFmt w:val="lowerRoman"/>
+      <w:lvlText w:val="%6."/>
+      <w:lvlJc w:val="right"/>
+      <w:pPr>
+        <w:ind w:left="4320" w:hanging="180"/>
+      </w:pPr>
+    </w:lvl>
+    <w:lvl w:ilvl="6" w:tplc="0409000F" w:tentative="1">
+      <w:start w:val="1"/>
+      <w:numFmt w:val="decimal"/>
+      <w:lvlText w:val="%7."/>
+      <w:lvlJc w:val="left"/>
+      <w:pPr>
+        <w:ind w:left="5040" w:hanging="360"/>
+      </w:pPr>
+    </w:lvl>
+    <w:lvl w:ilvl="7" w:tplc="04090019" w:tentative="1">
+      <w:start w:val="1"/>
+      <w:numFmt w:val="lowerLetter"/>
+      <w:lvlText w:val="%8."/>
+      <w:lvlJc w:val="left"/>
+      <w:pPr>
+        <w:ind w:left="5760" w:hanging="360"/>
+      </w:pPr>
+    </w:lvl>
+    <w:lvl w:ilvl="8" w:tplc="0409001B" w:tentative="1">
+      <w:start w:val="1"/>
+      <w:numFmt w:val="lowerRoman"/>
+      <w:lvlText w:val="%9."/>
+      <w:lvlJc w:val="right"/>
+      <w:pPr>
+        <w:ind w:left="6480" w:hanging="180"/>
+      </w:pPr>
+    </w:lvl>
+  </w:abstractNum>
+  <w:abstractNum w:abstractNumId="4" w15:restartNumberingAfterBreak="0">
+    <w:nsid w:val="7ACC2B8A"/>
+    <w:multiLevelType w:val="hybridMultilevel"/>
+    <w:tmpl w:val="558C4FA4"/>
+    <w:lvl w:ilvl="0" w:tplc="52CA9B04">
+      <w:start w:val="1"/>
+      <w:numFmt w:val="bullet"/>
+      <w:lvlText w:val=""/>
+      <w:lvlJc w:val="left"/>
+      <w:pPr>
+        <w:ind w:left="720" w:hanging="360"/>
+      </w:pPr>
+      <w:rPr>
+        <w:rFonts w:ascii="Symbol" w:eastAsiaTheme="minorHAnsi" w:hAnsi="Symbol" w:cstheme="minorBidi" w:hint="default"/>
+      </w:rPr>
+    </w:lvl>
+    <w:lvl w:ilvl="1" w:tplc="04090003" w:tentative="1">
+      <w:start w:val="1"/>
+      <w:numFmt w:val="bullet"/>
+      <w:lvlText w:val="o"/>
+      <w:lvlJc w:val="left"/>
+      <w:pPr>
+        <w:ind w:left="1440" w:hanging="360"/>
+      </w:pPr>
+      <w:rPr>
+        <w:rFonts w:ascii="Courier New" w:hAnsi="Courier New" w:cs="Courier New" w:hint="default"/>
+      </w:rPr>
+    </w:lvl>
+    <w:lvl w:ilvl="2" w:tplc="04090005" w:tentative="1">
+      <w:start w:val="1"/>
+      <w:numFmt w:val="bullet"/>
+      <w:lvlText w:val=""/>
+      <w:lvlJc w:val="left"/>
+      <w:pPr>
+        <w:ind w:left="2160" w:hanging="360"/>
+      </w:pPr>
+      <w:rPr>
+        <w:rFonts w:ascii="Wingdings" w:hAnsi="Wingdings" w:hint="default"/>
+      </w:rPr>
+    </w:lvl>
+    <w:lvl w:ilvl="3" w:tplc="04090001" w:tentative="1">
+      <w:start w:val="1"/>
+      <w:numFmt w:val="bullet"/>
+      <w:lvlText w:val=""/>
+      <w:lvlJc w:val="left"/>
+      <w:pPr>
+        <w:ind w:left="2880" w:hanging="360"/>
+      </w:pPr>
+      <w:rPr>
+        <w:rFonts w:ascii="Symbol" w:hAnsi="Symbol" w:hint="default"/>
+      </w:rPr>
+    </w:lvl>
+    <w:lvl w:ilvl="4" w:tplc="04090003" w:tentative="1">
+      <w:start w:val="1"/>
+      <w:numFmt w:val="bullet"/>
+      <w:lvlText w:val="o"/>
+      <w:lvlJc w:val="left"/>
+      <w:pPr>
+        <w:ind w:left="3600" w:hanging="360"/>
+      </w:pPr>
+      <w:rPr>
+        <w:rFonts w:ascii="Courier New" w:hAnsi="Courier New" w:cs="Courier New" w:hint="default"/>
+      </w:rPr>
+    </w:lvl>
+    <w:lvl w:ilvl="5" w:tplc="04090005" w:tentative="1">
+      <w:start w:val="1"/>
+      <w:numFmt w:val="bullet"/>
+      <w:lvlText w:val=""/>
+      <w:lvlJc w:val="left"/>
+      <w:pPr>
+        <w:ind w:left="4320" w:hanging="360"/>
+      </w:pPr>
+      <w:rPr>
+        <w:rFonts w:ascii="Wingdings" w:hAnsi="Wingdings" w:hint="default"/>
+      </w:rPr>
+    </w:lvl>
+    <w:lvl w:ilvl="6" w:tplc="04090001" w:tentative="1">
+      <w:start w:val="1"/>
+      <w:numFmt w:val="bullet"/>
+      <w:lvlText w:val=""/>
+      <w:lvlJc w:val="left"/>
+      <w:pPr>
+        <w:ind w:left="5040" w:hanging="360"/>
+      </w:pPr>
+      <w:rPr>
+        <w:rFonts w:ascii="Symbol" w:hAnsi="Symbol" w:hint="default"/>
+      </w:rPr>
+    </w:lvl>
+    <w:lvl w:ilvl="7" w:tplc="04090003" w:tentative="1">
+      <w:start w:val="1"/>
+      <w:numFmt w:val="bullet"/>
+      <w:lvlText w:val="o"/>
+      <w:lvlJc w:val="left"/>
+      <w:pPr>
+        <w:ind w:left="5760" w:hanging="360"/>
+      </w:pPr>
+      <w:rPr>
+        <w:rFonts w:ascii="Courier New" w:hAnsi="Courier New" w:cs="Courier New" w:hint="default"/>
+      </w:rPr>
+    </w:lvl>
+    <w:lvl w:ilvl="8" w:tplc="04090005" w:tentative="1">
+      <w:start w:val="1"/>
+      <w:numFmt w:val="bullet"/>
+      <w:lvlText w:val=""/>
+      <w:lvlJc w:val="left"/>
+      <w:pPr>
+        <w:ind w:left="6480" w:hanging="360"/>
+      </w:pPr>
+      <w:rPr>
+        <w:rFonts w:ascii="Wingdings" w:hAnsi="Wingdings" w:hint="default"/>
+      </w:rPr>
+    </w:lvl>
+  </w:abstractNum>
+  <w:num w:numId="1" w16cid:durableId="1838572045">
+    <w:abstractNumId w:val="2"/>
+  </w:num>
+  <w:num w:numId="2" w16cid:durableId="624118422">
+    <w:abstractNumId w:val="3"/>
+  </w:num>
+  <w:num w:numId="3" w16cid:durableId="1178304144">
+    <w:abstractNumId w:val="0"/>
+  </w:num>
+  <w:num w:numId="4" w16cid:durableId="288508846">
+    <w:abstractNumId w:val="4"/>
+  </w:num>
+  <w:num w:numId="5" w16cid:durableId="2054452686">
+    <w:abstractNumId w:val="1"/>
+  </w:num>
+</w:numbering>
 </file>
 
 <file path=word/styles.xml><?xml version="1.0" encoding="utf-8"?>
@@ -3525,6 +6530,91 @@
       <w:rFonts w:ascii="Times New Roman" w:hAnsi="Times New Roman" w:cs="Times New Roman"/>
     </w:rPr>
   </w:style>
+  <w:style w:type="paragraph" w:styleId="HTMLPreformatted">
+    <w:name w:val="HTML Preformatted"/>
+    <w:basedOn w:val="Normal"/>
+    <w:link w:val="HTMLPreformattedChar"/>
+    <w:uiPriority w:val="99"/>
+    <w:semiHidden/>
+    <w:unhideWhenUsed/>
+    <w:rsid w:val="009D6F34"/>
+    <w:pPr>
+      <w:tabs>
+        <w:tab w:val="left" w:pos="916"/>
+        <w:tab w:val="left" w:pos="1832"/>
+        <w:tab w:val="left" w:pos="2748"/>
+        <w:tab w:val="left" w:pos="3664"/>
+        <w:tab w:val="left" w:pos="4580"/>
+        <w:tab w:val="left" w:pos="5496"/>
+        <w:tab w:val="left" w:pos="6412"/>
+        <w:tab w:val="left" w:pos="7328"/>
+        <w:tab w:val="left" w:pos="8244"/>
+        <w:tab w:val="left" w:pos="9160"/>
+        <w:tab w:val="left" w:pos="10076"/>
+        <w:tab w:val="left" w:pos="10992"/>
+        <w:tab w:val="left" w:pos="11908"/>
+        <w:tab w:val="left" w:pos="12824"/>
+        <w:tab w:val="left" w:pos="13740"/>
+        <w:tab w:val="left" w:pos="14656"/>
+      </w:tabs>
+      <w:spacing w:after="0" w:line="240" w:lineRule="auto"/>
+    </w:pPr>
+    <w:rPr>
+      <w:rFonts w:ascii="Courier New" w:eastAsia="Times New Roman" w:hAnsi="Courier New" w:cs="Courier New"/>
+      <w:kern w:val="0"/>
+      <w:sz w:val="20"/>
+      <w:szCs w:val="20"/>
+      <w14:ligatures w14:val="none"/>
+    </w:rPr>
+  </w:style>
+  <w:style w:type="character" w:customStyle="1" w:styleId="HTMLPreformattedChar">
+    <w:name w:val="HTML Preformatted Char"/>
+    <w:basedOn w:val="DefaultParagraphFont"/>
+    <w:link w:val="HTMLPreformatted"/>
+    <w:uiPriority w:val="99"/>
+    <w:semiHidden/>
+    <w:rsid w:val="009D6F34"/>
+    <w:rPr>
+      <w:rFonts w:ascii="Courier New" w:eastAsia="Times New Roman" w:hAnsi="Courier New" w:cs="Courier New"/>
+      <w:kern w:val="0"/>
+      <w:sz w:val="20"/>
+      <w:szCs w:val="20"/>
+      <w14:ligatures w14:val="none"/>
+    </w:rPr>
+  </w:style>
+  <w:style w:type="character" w:styleId="PlaceholderText">
+    <w:name w:val="Placeholder Text"/>
+    <w:basedOn w:val="DefaultParagraphFont"/>
+    <w:uiPriority w:val="99"/>
+    <w:semiHidden/>
+    <w:rsid w:val="00912B05"/>
+    <w:rPr>
+      <w:color w:val="666666"/>
+    </w:rPr>
+  </w:style>
+  <w:style w:type="character" w:styleId="Hyperlink">
+    <w:name w:val="Hyperlink"/>
+    <w:basedOn w:val="DefaultParagraphFont"/>
+    <w:uiPriority w:val="99"/>
+    <w:unhideWhenUsed/>
+    <w:rsid w:val="006E4EBF"/>
+    <w:rPr>
+      <w:color w:val="467886" w:themeColor="hyperlink"/>
+      <w:u w:val="single"/>
+    </w:rPr>
+  </w:style>
+  <w:style w:type="character" w:styleId="UnresolvedMention">
+    <w:name w:val="Unresolved Mention"/>
+    <w:basedOn w:val="DefaultParagraphFont"/>
+    <w:uiPriority w:val="99"/>
+    <w:semiHidden/>
+    <w:unhideWhenUsed/>
+    <w:rsid w:val="006E4EBF"/>
+    <w:rPr>
+      <w:color w:val="605E5C"/>
+      <w:shd w:val="clear" w:color="auto" w:fill="E1DFDD"/>
+    </w:rPr>
+  </w:style>
 </w:styles>
 </file>
 

</xml_diff>

<commit_message>
Added Problem 4 report with part2 updated
</commit_message>
<xml_diff>
--- a/Problem4-Report.docx
+++ b/Problem4-Report.docx
@@ -967,35 +967,11 @@
         <w:jc w:val="both"/>
       </w:pPr>
       <w:r>
-        <w:t xml:space="preserve">From the results, Randomized Quicksort performed faster than Heapsort as the input size increased, especially for larger inputs like </w:t>
-      </w:r>
-      <m:oMath>
-        <m:sSup>
-          <m:sSupPr>
-            <m:ctrlPr>
-              <w:rPr>
-                <w:rFonts w:ascii="Cambria Math" w:hAnsi="Cambria Math"/>
-              </w:rPr>
-            </m:ctrlPr>
-          </m:sSupPr>
-          <m:e>
-            <m:r>
-              <w:rPr>
-                <w:rFonts w:ascii="Cambria Math" w:hAnsi="Cambria Math"/>
-              </w:rPr>
-              <m:t>10</m:t>
-            </m:r>
-          </m:e>
-          <m:sup>
-            <m:r>
-              <w:rPr>
-                <w:rFonts w:ascii="Cambria Math" w:hAnsi="Cambria Math"/>
-              </w:rPr>
-              <m:t>6</m:t>
-            </m:r>
-          </m:sup>
-        </m:sSup>
-      </m:oMath>
+        <w:t>From the results, Randomized Quicksort performed faster than Heapsort as the input size increased, especially for larger inputs lik</w:t>
+      </w:r>
+      <w:r>
+        <w:t>e 10^6</w:t>
+      </w:r>
       <w:r>
         <w:t>. However, Heapsort consistently used less memory compared to Quicksort across all input sizes. This shows a trade-off between the two algorithms, where Quicksort is more efficient in terms of running time, while Heapsort is more memory efficient. Overall, both algorithms performed correctly, but their performance differs depending on whether speed or memory is prioritized.</w:t>
       </w:r>
@@ -1367,13 +1343,28 @@
           <w:b/>
           <w:bCs/>
         </w:rPr>
-        <w:t>Execution time</w:t>
-      </w:r>
-      <w:r>
-        <w:t xml:space="preserve"> — both algorithms perform nearly identically at smaller input sizes. The gap becomes visible at 1,000,000 elements, where Randomized Quicksort completes in ~31.8 seconds compared to Heapsort's ~53.3 seconds. This reflects Quicksort's better cache locality in practice, giving it a real-world speed advantage even though both share the same </w:t>
+        <w:t xml:space="preserve">Execution </w:t>
       </w:r>
       <w:proofErr w:type="gramStart"/>
       <w:r>
+        <w:rPr>
+          <w:b/>
+          <w:bCs/>
+        </w:rPr>
+        <w:t>time</w:t>
+      </w:r>
+      <w:r>
+        <w:t xml:space="preserve"> </w:t>
+      </w:r>
+      <w:r>
+        <w:t>:</w:t>
+      </w:r>
+      <w:proofErr w:type="gramEnd"/>
+      <w:r>
+        <w:t xml:space="preserve"> both algorithms perform nearly identically at smaller input sizes. The gap becomes visible at 1,000,000 elements, where Randomized Quicksort completes in 31.8 seconds compared to Heapsort's 53.3 seconds. This reflects Quicksort's better cache locality in practice, giving it a real-world speed advantage even though both share the same </w:t>
+      </w:r>
+      <w:proofErr w:type="gramStart"/>
+      <w:r>
         <w:t>O(</w:t>
       </w:r>
       <w:proofErr w:type="gramEnd"/>
@@ -1387,10 +1378,25 @@
           <w:b/>
           <w:bCs/>
         </w:rPr>
-        <w:t>Peak memory</w:t>
-      </w:r>
-      <w:r>
-        <w:t xml:space="preserve"> — Heapsort consistently uses significantly less memory across all input sizes, peaking at just 2.18 KB even at 1,000,000 elements. Quicksort uses more memory due to its recursive call stack, though it remains modest overall. This confirms Heapsort's </w:t>
+        <w:t xml:space="preserve">Peak </w:t>
+      </w:r>
+      <w:proofErr w:type="gramStart"/>
+      <w:r>
+        <w:rPr>
+          <w:b/>
+          <w:bCs/>
+        </w:rPr>
+        <w:t>memory</w:t>
+      </w:r>
+      <w:r>
+        <w:t xml:space="preserve"> </w:t>
+      </w:r>
+      <w:r>
+        <w:t>:</w:t>
+      </w:r>
+      <w:proofErr w:type="gramEnd"/>
+      <w:r>
+        <w:t xml:space="preserve"> Heapsort consistently uses significantly less memory across all input sizes, peaking at just 2.18 KB even at 1,000,000 elements. Quicksort uses more memory due to its recursive call stack, though it remains modest overall. This confirms Heapsort's </w:t>
       </w:r>
       <w:r>
         <w:t>O (</w:t>
@@ -1415,66 +1421,15 @@
         </w:rPr>
       </w:pPr>
       <w:r>
+        <w:rPr>
+          <w:b/>
+          <w:bCs/>
+          <w:sz w:val="32"/>
+          <w:szCs w:val="32"/>
+        </w:rPr>
         <w:lastRenderedPageBreak/>
         <w:drawing>
-          <wp:anchor distT="0" distB="0" distL="114300" distR="114300" simplePos="0" relativeHeight="251664384" behindDoc="0" locked="0" layoutInCell="1" allowOverlap="1" wp14:anchorId="710165C2" wp14:editId="2CEE9BB1">
-            <wp:simplePos x="0" y="0"/>
-            <wp:positionH relativeFrom="column">
-              <wp:posOffset>-106680</wp:posOffset>
-            </wp:positionH>
-            <wp:positionV relativeFrom="paragraph">
-              <wp:posOffset>365760</wp:posOffset>
-            </wp:positionV>
-            <wp:extent cx="5943600" cy="2480310"/>
-            <wp:effectExtent l="0" t="0" r="0" b="0"/>
-            <wp:wrapNone/>
-            <wp:docPr id="201761330" name="Picture 1"/>
-            <wp:cNvGraphicFramePr>
-              <a:graphicFrameLocks xmlns:a="http://schemas.openxmlformats.org/drawingml/2006/main" noChangeAspect="1"/>
-            </wp:cNvGraphicFramePr>
-            <a:graphic xmlns:a="http://schemas.openxmlformats.org/drawingml/2006/main">
-              <a:graphicData uri="http://schemas.openxmlformats.org/drawingml/2006/picture">
-                <pic:pic xmlns:pic="http://schemas.openxmlformats.org/drawingml/2006/picture">
-                  <pic:nvPicPr>
-                    <pic:cNvPr id="201761330" name=""/>
-                    <pic:cNvPicPr/>
-                  </pic:nvPicPr>
-                  <pic:blipFill>
-                    <a:blip r:embed="rId12" cstate="print">
-                      <a:extLst>
-                        <a:ext uri="{28A0092B-C50C-407E-A947-70E740481C1C}">
-                          <a14:useLocalDpi xmlns:a14="http://schemas.microsoft.com/office/drawing/2010/main" val="0"/>
-                        </a:ext>
-                      </a:extLst>
-                    </a:blip>
-                    <a:stretch>
-                      <a:fillRect/>
-                    </a:stretch>
-                  </pic:blipFill>
-                  <pic:spPr>
-                    <a:xfrm>
-                      <a:off x="0" y="0"/>
-                      <a:ext cx="5943600" cy="2480310"/>
-                    </a:xfrm>
-                    <a:prstGeom prst="rect">
-                      <a:avLst/>
-                    </a:prstGeom>
-                  </pic:spPr>
-                </pic:pic>
-              </a:graphicData>
-            </a:graphic>
-          </wp:anchor>
-        </w:drawing>
-      </w:r>
-      <w:r>
-        <w:rPr>
-          <w:b/>
-          <w:bCs/>
-          <w:sz w:val="32"/>
-          <w:szCs w:val="32"/>
-        </w:rPr>
-        <w:drawing>
-          <wp:anchor distT="0" distB="0" distL="114300" distR="114300" simplePos="0" relativeHeight="251663360" behindDoc="0" locked="0" layoutInCell="1" allowOverlap="1" wp14:anchorId="19C0D2F4" wp14:editId="6746388F">
+          <wp:anchor distT="0" distB="0" distL="114300" distR="114300" simplePos="0" relativeHeight="251663360" behindDoc="0" locked="0" layoutInCell="1" allowOverlap="1" wp14:anchorId="19C0D2F4" wp14:editId="1AC909F0">
             <wp:simplePos x="0" y="0"/>
             <wp:positionH relativeFrom="column">
               <wp:posOffset>-213360</wp:posOffset>
@@ -1497,7 +1452,7 @@
                     <pic:cNvPicPr/>
                   </pic:nvPicPr>
                   <pic:blipFill>
-                    <a:blip r:embed="rId13">
+                    <a:blip r:embed="rId12">
                       <a:extLst>
                         <a:ext uri="{28A0092B-C50C-407E-A947-70E740481C1C}">
                           <a14:useLocalDpi xmlns:a14="http://schemas.microsoft.com/office/drawing/2010/main" val="0"/>
@@ -1562,7 +1517,7 @@
         <w:t>chart)</w:t>
       </w:r>
       <w:r>
-        <w:t xml:space="preserve"> at small and medium input sizes both algorithms are virtually indistinguishable, finishing in under 3 seconds. The difference becomes dramatic at 1,000,000 elements: Randomized Quicksort takes 31.79 seconds while Heapsort takes 53.28 seconds — roughly 1.7× slower. Despite Heapsort's superior worst-case guarantee on paper, Quicksort's better cache </w:t>
+        <w:t xml:space="preserve"> at small and medium input sizes both algorithms are virtually indistinguishable, finishing in under 3 seconds. The difference becomes dramatic at 1,000,000 elements: Randomized Quicksort takes 31.79 seconds while Heapsort takes 53.28 seconds roughly 1.7× slower. Despite Heapsort's superior worst-case guarantee on paper, Quicksort's better cache </w:t>
       </w:r>
       <w:proofErr w:type="spellStart"/>
       <w:r>
@@ -1696,7 +1651,7 @@
                     <pic:cNvPicPr/>
                   </pic:nvPicPr>
                   <pic:blipFill>
-                    <a:blip r:embed="rId14" cstate="print">
+                    <a:blip r:embed="rId13" cstate="print">
                       <a:extLst>
                         <a:ext uri="{28A0092B-C50C-407E-A947-70E740481C1C}">
                           <a14:useLocalDpi xmlns:a14="http://schemas.microsoft.com/office/drawing/2010/main" val="0"/>
@@ -1901,7 +1856,7 @@
                     <pic:cNvPicPr/>
                   </pic:nvPicPr>
                   <pic:blipFill>
-                    <a:blip r:embed="rId15" cstate="print">
+                    <a:blip r:embed="rId14" cstate="print">
                       <a:extLst>
                         <a:ext uri="{28A0092B-C50C-407E-A947-70E740481C1C}">
                           <a14:useLocalDpi xmlns:a14="http://schemas.microsoft.com/office/drawing/2010/main" val="0"/>
@@ -2000,7 +1955,7 @@
                     <pic:cNvPicPr/>
                   </pic:nvPicPr>
                   <pic:blipFill>
-                    <a:blip r:embed="rId16" cstate="print">
+                    <a:blip r:embed="rId15" cstate="print">
                       <a:extLst>
                         <a:ext uri="{28A0092B-C50C-407E-A947-70E740481C1C}">
                           <a14:useLocalDpi xmlns:a14="http://schemas.microsoft.com/office/drawing/2010/main" val="0"/>
@@ -2125,7 +2080,7 @@
                     <pic:cNvPicPr/>
                   </pic:nvPicPr>
                   <pic:blipFill>
-                    <a:blip r:embed="rId17"/>
+                    <a:blip r:embed="rId16"/>
                     <a:stretch>
                       <a:fillRect/>
                     </a:stretch>
@@ -2184,14 +2139,25 @@
         <w:t>x</w:t>
       </w:r>
       <w:r>
-        <w:t xml:space="preserve"> (log 10N / log N) ≈ 13</w:t>
+        <w:t xml:space="preserve"> (log 10N / log N) </w:t>
+      </w:r>
+      <w:r>
+        <w:t>=</w:t>
+      </w:r>
+      <w:r>
+        <w:t xml:space="preserve"> 13</w:t>
       </w:r>
       <w:r>
         <w:t>x</w:t>
       </w:r>
       <w:r>
-        <w:t>. Quicksort stays close to this 12.3</w:t>
-      </w:r>
+        <w:t xml:space="preserve">. Quicksort stays close to </w:t>
+      </w:r>
+      <w:proofErr w:type="gramStart"/>
+      <w:r>
+        <w:t>this 12.3</w:t>
+      </w:r>
+      <w:proofErr w:type="gramEnd"/>
       <w:r>
         <w:t>x</w:t>
       </w:r>
@@ -2217,7 +2183,13 @@
         <w:t>to</w:t>
       </w:r>
       <w:r>
-        <w:t xml:space="preserve"> 100K) and rises further to 18.9× (100K </w:t>
+        <w:t xml:space="preserve"> 100K) and rises further to 18.9</w:t>
+      </w:r>
+      <w:r>
+        <w:t>x</w:t>
+      </w:r>
+      <w:r>
+        <w:t xml:space="preserve"> (100K </w:t>
       </w:r>
       <w:r>
         <w:t>to</w:t>
@@ -2293,11 +2265,9 @@
       <w:r>
         <w:t xml:space="preserve"> is the ideal case for Quicksort. With randomly distributed values, the random pivot selection produces well-balanced partitions on average, giving consistent </w:t>
       </w:r>
-      <w:proofErr w:type="gramStart"/>
-      <w:r>
-        <w:t>O(</w:t>
-      </w:r>
-      <w:proofErr w:type="gramEnd"/>
+      <w:r>
+        <w:t>O (</w:t>
+      </w:r>
       <w:r>
         <w:t xml:space="preserve">n log n) performance. This was confirmed in </w:t>
       </w:r>
@@ -3665,7 +3635,7 @@
       <w:r>
         <w:t xml:space="preserve">These visualizations helped me a lot to understand how quicksort really works- </w:t>
       </w:r>
-      <w:hyperlink r:id="rId18" w:history="1">
+      <w:hyperlink r:id="rId17" w:history="1">
         <w:r>
           <w:rPr>
             <w:rStyle w:val="Hyperlink"/>
@@ -4107,7 +4077,7 @@
                     <pic:cNvPicPr/>
                   </pic:nvPicPr>
                   <pic:blipFill>
-                    <a:blip r:embed="rId19">
+                    <a:blip r:embed="rId18">
                       <a:extLst>
                         <a:ext uri="{28A0092B-C50C-407E-A947-70E740481C1C}">
                           <a14:useLocalDpi xmlns:a14="http://schemas.microsoft.com/office/drawing/2010/main" val="0"/>
@@ -4759,7 +4729,7 @@
           <w:numId w:val="5"/>
         </w:numPr>
       </w:pPr>
-      <w:hyperlink r:id="rId20" w:history="1">
+      <w:hyperlink r:id="rId19" w:history="1">
         <w:r>
           <w:rPr>
             <w:rStyle w:val="Hyperlink"/>
@@ -4776,7 +4746,7 @@
           <w:numId w:val="5"/>
         </w:numPr>
       </w:pPr>
-      <w:hyperlink r:id="rId21" w:history="1">
+      <w:hyperlink r:id="rId20" w:history="1">
         <w:r>
           <w:rPr>
             <w:rStyle w:val="Hyperlink"/>
@@ -4793,7 +4763,7 @@
           <w:numId w:val="5"/>
         </w:numPr>
       </w:pPr>
-      <w:hyperlink r:id="rId22" w:history="1">
+      <w:hyperlink r:id="rId21" w:history="1">
         <w:r>
           <w:rPr>
             <w:rStyle w:val="Hyperlink"/>
@@ -4810,7 +4780,7 @@
           <w:numId w:val="5"/>
         </w:numPr>
       </w:pPr>
-      <w:hyperlink r:id="rId23" w:history="1">
+      <w:hyperlink r:id="rId22" w:history="1">
         <w:r>
           <w:rPr>
             <w:rStyle w:val="Hyperlink"/>
@@ -4827,7 +4797,7 @@
           <w:numId w:val="5"/>
         </w:numPr>
       </w:pPr>
-      <w:hyperlink r:id="rId24" w:history="1">
+      <w:hyperlink r:id="rId23" w:history="1">
         <w:r>
           <w:rPr>
             <w:rStyle w:val="Hyperlink"/>
@@ -4844,7 +4814,7 @@
           <w:numId w:val="5"/>
         </w:numPr>
       </w:pPr>
-      <w:hyperlink r:id="rId25" w:history="1">
+      <w:hyperlink r:id="rId24" w:history="1">
         <w:r>
           <w:rPr>
             <w:rStyle w:val="Hyperlink"/>
@@ -4873,7 +4843,7 @@
           <w:numId w:val="5"/>
         </w:numPr>
       </w:pPr>
-      <w:hyperlink r:id="rId26" w:history="1">
+      <w:hyperlink r:id="rId25" w:history="1">
         <w:r>
           <w:rPr>
             <w:rStyle w:val="Hyperlink"/>
@@ -4890,7 +4860,7 @@
           <w:numId w:val="5"/>
         </w:numPr>
       </w:pPr>
-      <w:hyperlink r:id="rId27" w:history="1">
+      <w:hyperlink r:id="rId26" w:history="1">
         <w:r>
           <w:rPr>
             <w:rStyle w:val="Hyperlink"/>
@@ -4907,7 +4877,7 @@
           <w:numId w:val="5"/>
         </w:numPr>
       </w:pPr>
-      <w:hyperlink r:id="rId28" w:history="1">
+      <w:hyperlink r:id="rId27" w:history="1">
         <w:r>
           <w:rPr>
             <w:rStyle w:val="Hyperlink"/>
@@ -4935,7 +4905,7 @@
           <w:numId w:val="5"/>
         </w:numPr>
       </w:pPr>
-      <w:hyperlink r:id="rId29" w:history="1">
+      <w:hyperlink r:id="rId28" w:history="1">
         <w:r>
           <w:rPr>
             <w:rStyle w:val="Hyperlink"/>
@@ -4955,7 +4925,7 @@
           <w:numId w:val="5"/>
         </w:numPr>
       </w:pPr>
-      <w:hyperlink r:id="rId30" w:history="1">
+      <w:hyperlink r:id="rId29" w:history="1">
         <w:r>
           <w:rPr>
             <w:rStyle w:val="Hyperlink"/>
@@ -4972,7 +4942,7 @@
           <w:numId w:val="5"/>
         </w:numPr>
       </w:pPr>
-      <w:hyperlink r:id="rId31" w:history="1">
+      <w:hyperlink r:id="rId30" w:history="1">
         <w:r>
           <w:rPr>
             <w:rStyle w:val="Hyperlink"/>
@@ -4989,7 +4959,7 @@
           <w:numId w:val="5"/>
         </w:numPr>
       </w:pPr>
-      <w:hyperlink r:id="rId32" w:history="1">
+      <w:hyperlink r:id="rId31" w:history="1">
         <w:r>
           <w:rPr>
             <w:rStyle w:val="Hyperlink"/>

</xml_diff>